<commit_message>
Part 3: SCN/FB_DROP_TEST 본문 확정 + 캡션 SEQ 자동번호 전환
- Case 4A: SCN 기준 Flashback Table로 본문 확정(단일 Figure에 삭제 전 SCN·
  삭제 0건·FLASHBACK TO SCN·복구 확인 묶음), 확정 SQL 반영
- Case 4B: FB_DROP_TEST 기준 Flashback Drop 2개 Figure로 확정, 확정 SQL 반영,
  PURGE 정리 포함
- Case 5: impdp ORA-39143/imp 복구/BO_TEST·TBL_IDX01 검증 3개 Figure
- 기존 TIMESTAMP(4A)·CATEGORIES(4B)·초기백업 화면은 Appendix A-3/A-4/A-5로 보존
- 모든 Figure/Table 캡션을 고정 텍스트에서 Word SEQ 자동번호 필드로 전환
  (Figure 3-1~3-26, Table 3-1~3-8; 이후 캡처 삽입·이동 시 F9로 자동 재계산)
</commit_message>
<xml_diff>
--- a/report/PART3_재구성본.docx
+++ b/report/PART3_재구성본.docx
@@ -506,7 +506,25 @@
         <w:jc w:val="center"/>
       </w:pPr>
       <w:r>
-        <w:t>Table 3-1. Part 3 장애 시나리오와 복구 방식 구성</w:t>
+        <w:t>Table 3-</w:t>
+      </w:r>
+      <w:r>
+        <w:fldChar w:fldCharType="begin"/>
+      </w:r>
+      <w:r>
+        <w:instrText xml:space="preserve"> SEQ Table \* ARABIC </w:instrText>
+      </w:r>
+      <w:r>
+        <w:fldChar w:fldCharType="separate"/>
+      </w:r>
+      <w:r>
+        <w:t>1</w:t>
+      </w:r>
+      <w:r>
+        <w:fldChar w:fldCharType="end"/>
+      </w:r>
+      <w:r>
+        <w:t>. Part 3 장애 시나리오와 복구 방식 구성</w:t>
       </w:r>
     </w:p>
     <w:p>
@@ -756,7 +774,25 @@
         <w:jc w:val="center"/>
       </w:pPr>
       <w:r>
-        <w:t>Table 3-2. 물리적 장애와 논리적 장애의 특성 및 복구 방식 비교</w:t>
+        <w:t>Table 3-</w:t>
+      </w:r>
+      <w:r>
+        <w:fldChar w:fldCharType="begin"/>
+      </w:r>
+      <w:r>
+        <w:instrText xml:space="preserve"> SEQ Table \* ARABIC </w:instrText>
+      </w:r>
+      <w:r>
+        <w:fldChar w:fldCharType="separate"/>
+      </w:r>
+      <w:r>
+        <w:t>2</w:t>
+      </w:r>
+      <w:r>
+        <w:fldChar w:fldCharType="end"/>
+      </w:r>
+      <w:r>
+        <w:t>. 물리적 장애와 논리적 장애의 특성 및 복구 방식 비교</w:t>
       </w:r>
     </w:p>
     <w:p>
@@ -1032,7 +1068,25 @@
         <w:jc w:val="center"/>
       </w:pPr>
       <w:r>
-        <w:t>Table 3-3. 물리적 손상 범위별 RMAN 복구 방식과 서비스 영향</w:t>
+        <w:t>Table 3-</w:t>
+      </w:r>
+      <w:r>
+        <w:fldChar w:fldCharType="begin"/>
+      </w:r>
+      <w:r>
+        <w:instrText xml:space="preserve"> SEQ Table \* ARABIC </w:instrText>
+      </w:r>
+      <w:r>
+        <w:fldChar w:fldCharType="separate"/>
+      </w:r>
+      <w:r>
+        <w:t>3</w:t>
+      </w:r>
+      <w:r>
+        <w:fldChar w:fldCharType="end"/>
+      </w:r>
+      <w:r>
+        <w:t>. 물리적 손상 범위별 RMAN 복구 방식과 서비스 영향</w:t>
       </w:r>
     </w:p>
     <w:p>
@@ -1289,7 +1343,25 @@
         <w:jc w:val="center"/>
       </w:pPr>
       <w:r>
-        <w:t>Table 3-4. 논리적 장애 유형별 복구 기술과 적용 조건</w:t>
+        <w:t>Table 3-</w:t>
+      </w:r>
+      <w:r>
+        <w:fldChar w:fldCharType="begin"/>
+      </w:r>
+      <w:r>
+        <w:instrText xml:space="preserve"> SEQ Table \* ARABIC </w:instrText>
+      </w:r>
+      <w:r>
+        <w:fldChar w:fldCharType="separate"/>
+      </w:r>
+      <w:r>
+        <w:t>4</w:t>
+      </w:r>
+      <w:r>
+        <w:fldChar w:fldCharType="end"/>
+      </w:r>
+      <w:r>
+        <w:t>. 논리적 장애 유형별 복구 기술과 적용 조건</w:t>
       </w:r>
     </w:p>
     <w:p>
@@ -1710,7 +1782,25 @@
         <w:jc w:val="center"/>
       </w:pPr>
       <w:r>
-        <w:t>Table 3-5. 원본 백업·복구 가이드의 BO 스키마 적용 시 수정사항</w:t>
+        <w:t>Table 3-</w:t>
+      </w:r>
+      <w:r>
+        <w:fldChar w:fldCharType="begin"/>
+      </w:r>
+      <w:r>
+        <w:instrText xml:space="preserve"> SEQ Table \* ARABIC </w:instrText>
+      </w:r>
+      <w:r>
+        <w:fldChar w:fldCharType="separate"/>
+      </w:r>
+      <w:r>
+        <w:t>5</w:t>
+      </w:r>
+      <w:r>
+        <w:fldChar w:fldCharType="end"/>
+      </w:r>
+      <w:r>
+        <w:t>. 원본 백업·복구 가이드의 BO 스키마 적용 시 수정사항</w:t>
       </w:r>
     </w:p>
     <w:p>
@@ -1911,7 +2001,25 @@
         <w:jc w:val="center"/>
       </w:pPr>
       <w:r>
-        <w:t>Figure 3-1. ARCHIVELOG 모드 전환 및 데이터베이스 운영 상태 확인</w:t>
+        <w:t>Figure 3-</w:t>
+      </w:r>
+      <w:r>
+        <w:fldChar w:fldCharType="begin"/>
+      </w:r>
+      <w:r>
+        <w:instrText xml:space="preserve"> SEQ Figure \* ARABIC </w:instrText>
+      </w:r>
+      <w:r>
+        <w:fldChar w:fldCharType="separate"/>
+      </w:r>
+      <w:r>
+        <w:t>1</w:t>
+      </w:r>
+      <w:r>
+        <w:fldChar w:fldCharType="end"/>
+      </w:r>
+      <w:r>
+        <w:t>. ARCHIVELOG 모드 전환 및 데이터베이스 운영 상태 확인</w:t>
       </w:r>
     </w:p>
     <w:p>
@@ -1996,7 +2104,25 @@
         <w:jc w:val="center"/>
       </w:pPr>
       <w:r>
-        <w:t>Figure 3-2. 전용 테이블스페이스 생성 전 데이터파일 경로 확인</w:t>
+        <w:t>Figure 3-</w:t>
+      </w:r>
+      <w:r>
+        <w:fldChar w:fldCharType="begin"/>
+      </w:r>
+      <w:r>
+        <w:instrText xml:space="preserve"> SEQ Figure \* ARABIC </w:instrText>
+      </w:r>
+      <w:r>
+        <w:fldChar w:fldCharType="separate"/>
+      </w:r>
+      <w:r>
+        <w:t>2</w:t>
+      </w:r>
+      <w:r>
+        <w:fldChar w:fldCharType="end"/>
+      </w:r>
+      <w:r>
+        <w:t>. 전용 테이블스페이스 생성 전 데이터파일 경로 확인</w:t>
       </w:r>
     </w:p>
     <w:p>
@@ -2130,7 +2256,25 @@
         <w:jc w:val="center"/>
       </w:pPr>
       <w:r>
-        <w:t>Figure 3-3. TS_ORDERS·TS_INQUIRIES 전용 테이블스페이스 생성 결과</w:t>
+        <w:t>Figure 3-</w:t>
+      </w:r>
+      <w:r>
+        <w:fldChar w:fldCharType="begin"/>
+      </w:r>
+      <w:r>
+        <w:instrText xml:space="preserve"> SEQ Figure \* ARABIC </w:instrText>
+      </w:r>
+      <w:r>
+        <w:fldChar w:fldCharType="separate"/>
+      </w:r>
+      <w:r>
+        <w:t>3</w:t>
+      </w:r>
+      <w:r>
+        <w:fldChar w:fldCharType="end"/>
+      </w:r>
+      <w:r>
+        <w:t>. TS_ORDERS·TS_INQUIRIES 전용 테이블스페이스 생성 결과</w:t>
       </w:r>
     </w:p>
     <w:p>
@@ -2287,7 +2431,25 @@
         <w:jc w:val="center"/>
       </w:pPr>
       <w:r>
-        <w:t>Figure 3-4. 전용 테이블스페이스의 테이블·인덱스·LOB 및 데이터파일 상태 검증</w:t>
+        <w:t>Figure 3-</w:t>
+      </w:r>
+      <w:r>
+        <w:fldChar w:fldCharType="begin"/>
+      </w:r>
+      <w:r>
+        <w:instrText xml:space="preserve"> SEQ Figure \* ARABIC </w:instrText>
+      </w:r>
+      <w:r>
+        <w:fldChar w:fldCharType="separate"/>
+      </w:r>
+      <w:r>
+        <w:t>4</w:t>
+      </w:r>
+      <w:r>
+        <w:fldChar w:fldCharType="end"/>
+      </w:r>
+      <w:r>
+        <w:t>. 전용 테이블스페이스의 테이블·인덱스·LOB 및 데이터파일 상태 검증</w:t>
       </w:r>
     </w:p>
     <w:p>
@@ -2348,7 +2510,25 @@
         <w:jc w:val="center"/>
       </w:pPr>
       <w:r>
-        <w:t>Figure 3-5. 전용 테이블스페이스 구성 후 RMAN 베이스라인 Full Backup 수행</w:t>
+        <w:t>Figure 3-</w:t>
+      </w:r>
+      <w:r>
+        <w:fldChar w:fldCharType="begin"/>
+      </w:r>
+      <w:r>
+        <w:instrText xml:space="preserve"> SEQ Figure \* ARABIC </w:instrText>
+      </w:r>
+      <w:r>
+        <w:fldChar w:fldCharType="separate"/>
+      </w:r>
+      <w:r>
+        <w:t>5</w:t>
+      </w:r>
+      <w:r>
+        <w:fldChar w:fldCharType="end"/>
+      </w:r>
+      <w:r>
+        <w:t>. 전용 테이블스페이스 구성 후 RMAN 베이스라인 Full Backup 수행</w:t>
       </w:r>
     </w:p>
     <w:p>
@@ -2423,7 +2603,25 @@
         <w:jc w:val="center"/>
       </w:pPr>
       <w:r>
-        <w:t>Figure 3-6. RMAN 베이스라인 백업 세트 생성 결과 확인</w:t>
+        <w:t>Figure 3-</w:t>
+      </w:r>
+      <w:r>
+        <w:fldChar w:fldCharType="begin"/>
+      </w:r>
+      <w:r>
+        <w:instrText xml:space="preserve"> SEQ Figure \* ARABIC </w:instrText>
+      </w:r>
+      <w:r>
+        <w:fldChar w:fldCharType="separate"/>
+      </w:r>
+      <w:r>
+        <w:t>6</w:t>
+      </w:r>
+      <w:r>
+        <w:fldChar w:fldCharType="end"/>
+      </w:r>
+      <w:r>
+        <w:t>. RMAN 베이스라인 백업 세트 생성 결과 확인</w:t>
       </w:r>
     </w:p>
     <w:p>
@@ -2511,7 +2709,25 @@
         <w:jc w:val="center"/>
       </w:pPr>
       <w:r>
-        <w:t>Figure 3-7. Case 1 대상 데이터파일의 FILE_ID와 경로 확인</w:t>
+        <w:t>Figure 3-</w:t>
+      </w:r>
+      <w:r>
+        <w:fldChar w:fldCharType="begin"/>
+      </w:r>
+      <w:r>
+        <w:instrText xml:space="preserve"> SEQ Figure \* ARABIC </w:instrText>
+      </w:r>
+      <w:r>
+        <w:fldChar w:fldCharType="separate"/>
+      </w:r>
+      <w:r>
+        <w:t>7</w:t>
+      </w:r>
+      <w:r>
+        <w:fldChar w:fldCharType="end"/>
+      </w:r>
+      <w:r>
+        <w:t>. Case 1 대상 데이터파일의 FILE_ID와 경로 확인</w:t>
       </w:r>
     </w:p>
     <w:tbl>
@@ -2667,7 +2883,25 @@
         <w:jc w:val="center"/>
       </w:pPr>
       <w:r>
-        <w:t>Table 3-6. Case 1 초기 장애 재현 과정에서 확인된 차이와 보완 조치</w:t>
+        <w:t>Table 3-</w:t>
+      </w:r>
+      <w:r>
+        <w:fldChar w:fldCharType="begin"/>
+      </w:r>
+      <w:r>
+        <w:instrText xml:space="preserve"> SEQ Table \* ARABIC </w:instrText>
+      </w:r>
+      <w:r>
+        <w:fldChar w:fldCharType="separate"/>
+      </w:r>
+      <w:r>
+        <w:t>6</w:t>
+      </w:r>
+      <w:r>
+        <w:fldChar w:fldCharType="end"/>
+      </w:r>
+      <w:r>
+        <w:t>. Case 1 초기 장애 재현 과정에서 확인된 차이와 보완 조치</w:t>
       </w:r>
     </w:p>
     <w:p>
@@ -2813,7 +3047,25 @@
         <w:jc w:val="center"/>
       </w:pPr>
       <w:r>
-        <w:t>Figure 3-8. Case 1 데이터파일 장애 발생 및 ORDERS 접근 실패 확인</w:t>
+        <w:t>Figure 3-</w:t>
+      </w:r>
+      <w:r>
+        <w:fldChar w:fldCharType="begin"/>
+      </w:r>
+      <w:r>
+        <w:instrText xml:space="preserve"> SEQ Figure \* ARABIC </w:instrText>
+      </w:r>
+      <w:r>
+        <w:fldChar w:fldCharType="separate"/>
+      </w:r>
+      <w:r>
+        <w:t>8</w:t>
+      </w:r>
+      <w:r>
+        <w:fldChar w:fldCharType="end"/>
+      </w:r>
+      <w:r>
+        <w:t>. Case 1 데이터파일 장애 발생 및 ORDERS 접근 실패 확인</w:t>
       </w:r>
     </w:p>
     <w:p>
@@ -2861,7 +3113,25 @@
         <w:jc w:val="center"/>
       </w:pPr>
       <w:r>
-        <w:t>Figure 3-9. Case 1 장애 중 다른 BO 테이블(CUSTOMERS·PRODUCTS)의 서비스 지속 확인</w:t>
+        <w:t>Figure 3-</w:t>
+      </w:r>
+      <w:r>
+        <w:fldChar w:fldCharType="begin"/>
+      </w:r>
+      <w:r>
+        <w:instrText xml:space="preserve"> SEQ Figure \* ARABIC </w:instrText>
+      </w:r>
+      <w:r>
+        <w:fldChar w:fldCharType="separate"/>
+      </w:r>
+      <w:r>
+        <w:t>9</w:t>
+      </w:r>
+      <w:r>
+        <w:fldChar w:fldCharType="end"/>
+      </w:r>
+      <w:r>
+        <w:t>. Case 1 장애 중 다른 BO 테이블(CUSTOMERS·PRODUCTS)의 서비스 지속 확인</w:t>
       </w:r>
     </w:p>
     <w:p>
@@ -3017,7 +3287,25 @@
         <w:jc w:val="center"/>
       </w:pPr>
       <w:r>
-        <w:t>Figure 3-10. Case 1 RMAN 데이터파일 RESTORE·RECOVER 수행 결과</w:t>
+        <w:t>Figure 3-</w:t>
+      </w:r>
+      <w:r>
+        <w:fldChar w:fldCharType="begin"/>
+      </w:r>
+      <w:r>
+        <w:instrText xml:space="preserve"> SEQ Figure \* ARABIC </w:instrText>
+      </w:r>
+      <w:r>
+        <w:fldChar w:fldCharType="separate"/>
+      </w:r>
+      <w:r>
+        <w:t>10</w:t>
+      </w:r>
+      <w:r>
+        <w:fldChar w:fldCharType="end"/>
+      </w:r>
+      <w:r>
+        <w:t>. Case 1 RMAN 데이터파일 RESTORE·RECOVER 수행 결과</w:t>
       </w:r>
     </w:p>
     <w:p>
@@ -3065,7 +3353,25 @@
         <w:jc w:val="center"/>
       </w:pPr>
       <w:r>
-        <w:t>Figure 3-11. Case 1 ORDERS 데이터파일 복구 및 정상 조회 확인</w:t>
+        <w:t>Figure 3-</w:t>
+      </w:r>
+      <w:r>
+        <w:fldChar w:fldCharType="begin"/>
+      </w:r>
+      <w:r>
+        <w:instrText xml:space="preserve"> SEQ Figure \* ARABIC </w:instrText>
+      </w:r>
+      <w:r>
+        <w:fldChar w:fldCharType="separate"/>
+      </w:r>
+      <w:r>
+        <w:t>11</w:t>
+      </w:r>
+      <w:r>
+        <w:fldChar w:fldCharType="end"/>
+      </w:r>
+      <w:r>
+        <w:t>. Case 1 ORDERS 데이터파일 복구 및 정상 조회 확인</w:t>
       </w:r>
     </w:p>
     <w:p>
@@ -3340,7 +3646,25 @@
         <w:jc w:val="center"/>
       </w:pPr>
       <w:r>
-        <w:t>Figure 3-12. Case 2 SYSTEM 데이터파일 부재 및 데이터베이스 OPEN 실패 확인</w:t>
+        <w:t>Figure 3-</w:t>
+      </w:r>
+      <w:r>
+        <w:fldChar w:fldCharType="begin"/>
+      </w:r>
+      <w:r>
+        <w:instrText xml:space="preserve"> SEQ Figure \* ARABIC </w:instrText>
+      </w:r>
+      <w:r>
+        <w:fldChar w:fldCharType="separate"/>
+      </w:r>
+      <w:r>
+        <w:t>12</w:t>
+      </w:r>
+      <w:r>
+        <w:fldChar w:fldCharType="end"/>
+      </w:r>
+      <w:r>
+        <w:t>. Case 2 SYSTEM 데이터파일 부재 및 데이터베이스 OPEN 실패 확인</w:t>
       </w:r>
     </w:p>
     <w:p>
@@ -3632,7 +3956,25 @@
         <w:jc w:val="center"/>
       </w:pPr>
       <w:r>
-        <w:t>Figure 3-13. Case 2 SYSTEM 데이터파일 RMAN RESTORE·RECOVER 수행</w:t>
+        <w:t>Figure 3-</w:t>
+      </w:r>
+      <w:r>
+        <w:fldChar w:fldCharType="begin"/>
+      </w:r>
+      <w:r>
+        <w:instrText xml:space="preserve"> SEQ Figure \* ARABIC </w:instrText>
+      </w:r>
+      <w:r>
+        <w:fldChar w:fldCharType="separate"/>
+      </w:r>
+      <w:r>
+        <w:t>13</w:t>
+      </w:r>
+      <w:r>
+        <w:fldChar w:fldCharType="end"/>
+      </w:r>
+      <w:r>
+        <w:t>. Case 2 SYSTEM 데이터파일 RMAN RESTORE·RECOVER 수행</w:t>
       </w:r>
     </w:p>
     <w:p>
@@ -3719,7 +4061,25 @@
         <w:jc w:val="center"/>
       </w:pPr>
       <w:r>
-        <w:t>Figure 3-14. Case 2 데이터베이스 OPEN 및 BO 스키마 정상 조회 확인</w:t>
+        <w:t>Figure 3-</w:t>
+      </w:r>
+      <w:r>
+        <w:fldChar w:fldCharType="begin"/>
+      </w:r>
+      <w:r>
+        <w:instrText xml:space="preserve"> SEQ Figure \* ARABIC </w:instrText>
+      </w:r>
+      <w:r>
+        <w:fldChar w:fldCharType="separate"/>
+      </w:r>
+      <w:r>
+        <w:t>14</w:t>
+      </w:r>
+      <w:r>
+        <w:fldChar w:fldCharType="end"/>
+      </w:r>
+      <w:r>
+        <w:t>. Case 2 데이터베이스 OPEN 및 BO 스키마 정상 조회 확인</w:t>
       </w:r>
     </w:p>
     <w:p>
@@ -3824,7 +4184,25 @@
         <w:jc w:val="center"/>
       </w:pPr>
       <w:r>
-        <w:t>Figure 3-15. Case 3 손상 대상 행의 FILE_NO·BLOCK_NO 확인</w:t>
+        <w:t>Figure 3-</w:t>
+      </w:r>
+      <w:r>
+        <w:fldChar w:fldCharType="begin"/>
+      </w:r>
+      <w:r>
+        <w:instrText xml:space="preserve"> SEQ Figure \* ARABIC </w:instrText>
+      </w:r>
+      <w:r>
+        <w:fldChar w:fldCharType="separate"/>
+      </w:r>
+      <w:r>
+        <w:t>15</w:t>
+      </w:r>
+      <w:r>
+        <w:fldChar w:fldCharType="end"/>
+      </w:r>
+      <w:r>
+        <w:t>. Case 3 손상 대상 행의 FILE_NO·BLOCK_NO 확인</w:t>
       </w:r>
     </w:p>
     <w:p>
@@ -4106,7 +4484,25 @@
         <w:jc w:val="center"/>
       </w:pPr>
       <w:r>
-        <w:t>Figure 3-16. Case 3 ORA-01578 및 V$DATABASE_BLOCK_CORRUPTION 손상 블록 확인</w:t>
+        <w:t>Figure 3-</w:t>
+      </w:r>
+      <w:r>
+        <w:fldChar w:fldCharType="begin"/>
+      </w:r>
+      <w:r>
+        <w:instrText xml:space="preserve"> SEQ Figure \* ARABIC </w:instrText>
+      </w:r>
+      <w:r>
+        <w:fldChar w:fldCharType="separate"/>
+      </w:r>
+      <w:r>
+        <w:t>16</w:t>
+      </w:r>
+      <w:r>
+        <w:fldChar w:fldCharType="end"/>
+      </w:r>
+      <w:r>
+        <w:t>. Case 3 ORA-01578 및 V$DATABASE_BLOCK_CORRUPTION 손상 블록 확인</w:t>
       </w:r>
     </w:p>
     <w:p>
@@ -4168,7 +4564,25 @@
         <w:jc w:val="center"/>
       </w:pPr>
       <w:r>
-        <w:t>Figure 3-17. Case 3 RMAN Block Media Recovery 수행 결과</w:t>
+        <w:t>Figure 3-</w:t>
+      </w:r>
+      <w:r>
+        <w:fldChar w:fldCharType="begin"/>
+      </w:r>
+      <w:r>
+        <w:instrText xml:space="preserve"> SEQ Figure \* ARABIC </w:instrText>
+      </w:r>
+      <w:r>
+        <w:fldChar w:fldCharType="separate"/>
+      </w:r>
+      <w:r>
+        <w:t>17</w:t>
+      </w:r>
+      <w:r>
+        <w:fldChar w:fldCharType="end"/>
+      </w:r>
+      <w:r>
+        <w:t>. Case 3 RMAN Block Media Recovery 수행 결과</w:t>
       </w:r>
     </w:p>
     <w:p>
@@ -4333,7 +4747,25 @@
         <w:jc w:val="center"/>
       </w:pPr>
       <w:r>
-        <w:t>Figure 3-18. Case 3 손상 행 정상 조회 및 블록 손상 정보 제거 확인</w:t>
+        <w:t>Figure 3-</w:t>
+      </w:r>
+      <w:r>
+        <w:fldChar w:fldCharType="begin"/>
+      </w:r>
+      <w:r>
+        <w:instrText xml:space="preserve"> SEQ Figure \* ARABIC </w:instrText>
+      </w:r>
+      <w:r>
+        <w:fldChar w:fldCharType="separate"/>
+      </w:r>
+      <w:r>
+        <w:t>18</w:t>
+      </w:r>
+      <w:r>
+        <w:fldChar w:fldCharType="end"/>
+      </w:r>
+      <w:r>
+        <w:t>. Case 3 손상 행 정상 조회 및 블록 손상 정보 제거 확인</w:t>
       </w:r>
     </w:p>
     <w:p>
@@ -4354,12 +4786,12 @@
         <w:pStyle w:val="3"/>
       </w:pPr>
       <w:r>
-        <w:t>① Case 4A — CUST_CONTACTS DELETE와 Flashback Table</w:t>
-      </w:r>
-    </w:p>
-    <w:p>
-      <w:r>
-        <w:t>잘못된 DELETE는 대표적인 논리적 장애이다. BO 스키마에서는 FK 피참조 관계가 없는 CUST_CONTACTS를 대상으로 전체 삭제 후 Flashback Table을 검증하였다.</w:t>
+        <w:t>① Case 4A — SCN 기준 Flashback Table</w:t>
+      </w:r>
+    </w:p>
+    <w:p>
+      <w:r>
+        <w:t>잘못된 DELETE는 대표적인 논리적 장애이다. BO 스키마에서는 FK 피참조 관계가 없는 CUST_CONTACTS를 대상으로, 삭제 직전 SCN을 저장한 뒤 삭제·COMMIT 후 해당 SCN으로 복구하는 방식으로 Flashback Table을 검증하였다. 삭제 전 건수와 복구 기준 SCN을 먼저 확보한다.</w:t>
       </w:r>
     </w:p>
     <w:p>
@@ -4383,7 +4815,6 @@
           <w:rFonts w:ascii="Consolas" w:hAnsi="Consolas" w:eastAsia="Consolas"/>
           <w:sz w:val="19"/>
         </w:rPr>
-        <w:t>VARIABLE v_before_scn NUMBER;</w:t>
       </w:r>
       <w:r>
         <w:br/>
@@ -4393,7 +4824,7 @@
           <w:rFonts w:ascii="Consolas" w:hAnsi="Consolas" w:eastAsia="Consolas"/>
           <w:sz w:val="19"/>
         </w:rPr>
-        <w:t>BEGIN</w:t>
+        <w:t>SELECT COUNT(*) AS BEFORE_CNT</w:t>
       </w:r>
       <w:r>
         <w:br/>
@@ -4403,7 +4834,7 @@
           <w:rFonts w:ascii="Consolas" w:hAnsi="Consolas" w:eastAsia="Consolas"/>
           <w:sz w:val="19"/>
         </w:rPr>
-        <w:t xml:space="preserve">  :v_before_scn := DBMS_FLASHBACK.GET_SYSTEM_CHANGE_NUMBER;</w:t>
+        <w:t>FROM BO.CUST_CONTACTS;</w:t>
       </w:r>
       <w:r>
         <w:br/>
@@ -4413,7 +4844,6 @@
           <w:rFonts w:ascii="Consolas" w:hAnsi="Consolas" w:eastAsia="Consolas"/>
           <w:sz w:val="19"/>
         </w:rPr>
-        <w:t>END;</w:t>
       </w:r>
       <w:r>
         <w:br/>
@@ -4423,7 +4853,22 @@
           <w:rFonts w:ascii="Consolas" w:hAnsi="Consolas" w:eastAsia="Consolas"/>
           <w:sz w:val="19"/>
         </w:rPr>
-        <w:t>/</w:t>
+        <w:t>SELECT DBMS_FLASHBACK.GET_SYSTEM_CHANGE_NUMBER AS BEFORE_SCN</w:t>
+      </w:r>
+      <w:r>
+        <w:br/>
+      </w:r>
+      <w:r>
+        <w:rPr>
+          <w:rFonts w:ascii="Consolas" w:hAnsi="Consolas" w:eastAsia="Consolas"/>
+          <w:sz w:val="19"/>
+        </w:rPr>
+        <w:t>FROM DUAL;</w:t>
+      </w:r>
+    </w:p>
+    <w:p>
+      <w:r>
+        <w:t>조회된 SCN을 별도로 기록한 뒤, 삭제·COMMIT을 수행하고 기록한 SCN으로 복구한다. Flashback은 UNDO_RETENTION 시간 안에 수행해야 한다.</w:t>
       </w:r>
     </w:p>
     <w:p>
@@ -4457,7 +4902,2151 @@
           <w:rFonts w:ascii="Consolas" w:hAnsi="Consolas" w:eastAsia="Consolas"/>
           <w:sz w:val="19"/>
         </w:rPr>
-        <w:t>SELECT COUNT(*) FROM BO.CUST_CONTACTS;</w:t>
+      </w:r>
+      <w:r>
+        <w:br/>
+      </w:r>
+      <w:r>
+        <w:rPr>
+          <w:rFonts w:ascii="Consolas" w:hAnsi="Consolas" w:eastAsia="Consolas"/>
+          <w:sz w:val="19"/>
+        </w:rPr>
+        <w:t>SELECT COUNT(*) AS AFTER_DELETE_CNT</w:t>
+      </w:r>
+      <w:r>
+        <w:br/>
+      </w:r>
+      <w:r>
+        <w:rPr>
+          <w:rFonts w:ascii="Consolas" w:hAnsi="Consolas" w:eastAsia="Consolas"/>
+          <w:sz w:val="19"/>
+        </w:rPr>
+        <w:t>FROM BO.CUST_CONTACTS;</w:t>
+      </w:r>
+      <w:r>
+        <w:br/>
+      </w:r>
+      <w:r>
+        <w:rPr>
+          <w:rFonts w:ascii="Consolas" w:hAnsi="Consolas" w:eastAsia="Consolas"/>
+          <w:sz w:val="19"/>
+        </w:rPr>
+      </w:r>
+      <w:r>
+        <w:br/>
+      </w:r>
+      <w:r>
+        <w:rPr>
+          <w:rFonts w:ascii="Consolas" w:hAnsi="Consolas" w:eastAsia="Consolas"/>
+          <w:sz w:val="19"/>
+        </w:rPr>
+        <w:t>FLASHBACK TABLE BO.CUST_CONTACTS</w:t>
+      </w:r>
+      <w:r>
+        <w:br/>
+      </w:r>
+      <w:r>
+        <w:rPr>
+          <w:rFonts w:ascii="Consolas" w:hAnsi="Consolas" w:eastAsia="Consolas"/>
+          <w:sz w:val="19"/>
+        </w:rPr>
+        <w:t>TO SCN &lt;기록한_SCN&gt;;</w:t>
+      </w:r>
+      <w:r>
+        <w:br/>
+      </w:r>
+      <w:r>
+        <w:rPr>
+          <w:rFonts w:ascii="Consolas" w:hAnsi="Consolas" w:eastAsia="Consolas"/>
+          <w:sz w:val="19"/>
+        </w:rPr>
+      </w:r>
+      <w:r>
+        <w:br/>
+      </w:r>
+      <w:r>
+        <w:rPr>
+          <w:rFonts w:ascii="Consolas" w:hAnsi="Consolas" w:eastAsia="Consolas"/>
+          <w:sz w:val="19"/>
+        </w:rPr>
+        <w:t>SELECT COUNT(*) AS AFTER_FLASHBACK_CNT</w:t>
+      </w:r>
+      <w:r>
+        <w:br/>
+      </w:r>
+      <w:r>
+        <w:rPr>
+          <w:rFonts w:ascii="Consolas" w:hAnsi="Consolas" w:eastAsia="Consolas"/>
+          <w:sz w:val="19"/>
+        </w:rPr>
+        <w:t>FROM BO.CUST_CONTACTS;</w:t>
+      </w:r>
+    </w:p>
+    <w:p>
+      <w:pPr>
+        <w:jc w:val="center"/>
+        <w:shd w:val="clear" w:fill="FBEAE7"/>
+      </w:pPr>
+      <w:r>
+        <w:rPr>
+          <w:i/>
+          <w:color w:val="B03A2E"/>
+          <w:sz w:val="20"/>
+        </w:rPr>
+        <w:t>［ 재실행 후 이 위치에 실행 화면 삽입 ］</w:t>
+      </w:r>
+    </w:p>
+    <w:p>
+      <w:pPr>
+        <w:pStyle w:val="a5"/>
+        <w:jc w:val="center"/>
+      </w:pPr>
+      <w:r>
+        <w:t>Figure 3-</w:t>
+      </w:r>
+      <w:r>
+        <w:fldChar w:fldCharType="begin"/>
+      </w:r>
+      <w:r>
+        <w:instrText xml:space="preserve"> SEQ Figure \* ARABIC </w:instrText>
+      </w:r>
+      <w:r>
+        <w:fldChar w:fldCharType="separate"/>
+      </w:r>
+      <w:r>
+        <w:t>19</w:t>
+      </w:r>
+      <w:r>
+        <w:fldChar w:fldCharType="end"/>
+      </w:r>
+      <w:r>
+        <w:t>. Case 4A SCN 기준 CUST_CONTACTS 삭제 및 Flashback Table 복구 결과</w:t>
+      </w:r>
+    </w:p>
+    <w:p>
+      <w:r>
+        <w:t>※ 위 한 개의 Figure에 (1) 삭제 전 건수·복구 기준 SCN, (2) DELETE·COMMIT 후 0건, (3) FLASHBACK TABLE … TO SCN 수행, (4) 원래 건수 복구 확인 화면을 묶는다. 이미 수행한 TIMESTAMP 방식 초기 실험 화면은 Appendix A-3에 보존하였다.</w:t>
+      </w:r>
+    </w:p>
+    <w:p>
+      <w:r>
+        <w:t>Flashback Table은 백업 복원 없이 특정 테이블을 사고 이전 SCN으로 되돌릴 수 있었으나, 충분한 UNDO 보존과 ROW MOVEMENT 설정이 필요하였다.</w:t>
+      </w:r>
+    </w:p>
+    <w:p>
+      <w:pPr>
+        <w:pStyle w:val="3"/>
+      </w:pPr>
+      <w:r>
+        <w:t>② Case 4B — FB_DROP_TEST 기준 Flashback Drop</w:t>
+      </w:r>
+    </w:p>
+    <w:p>
+      <w:r>
+        <w:t>CATEGORIES는 PRODUCTS가 FK로 참조하는 부모 테이블이다. 일반 DROP은 ORA-02449로 거부되고, CASCADE CONSTRAINTS를 사용하면 자식 테이블의 FK까지 제거되어 복구 범위가 확대된다. 따라서 실제 업무 객체를 다시 손상시키지 않고, 동일 구조의 독립 테스트 테이블 FB_DROP_TEST를 생성하여 Flashback Drop 메커니즘만 재실행·검증하였다.</w:t>
+      </w:r>
+    </w:p>
+    <w:p>
+      <w:pPr>
+        <w:spacing w:after="80"/>
+        <w:ind w:left="288"/>
+        <w:shd w:val="clear" w:fill="F2F3F5"/>
+      </w:pPr>
+      <w:r>
+        <w:rPr>
+          <w:rFonts w:ascii="Consolas" w:hAnsi="Consolas" w:eastAsia="Consolas"/>
+          <w:sz w:val="19"/>
+        </w:rPr>
+        <w:t>CREATE TABLE BO.FB_DROP_TEST</w:t>
+      </w:r>
+      <w:r>
+        <w:br/>
+      </w:r>
+      <w:r>
+        <w:rPr>
+          <w:rFonts w:ascii="Consolas" w:hAnsi="Consolas" w:eastAsia="Consolas"/>
+          <w:sz w:val="19"/>
+        </w:rPr>
+        <w:t>AS</w:t>
+      </w:r>
+      <w:r>
+        <w:br/>
+      </w:r>
+      <w:r>
+        <w:rPr>
+          <w:rFonts w:ascii="Consolas" w:hAnsi="Consolas" w:eastAsia="Consolas"/>
+          <w:sz w:val="19"/>
+        </w:rPr>
+        <w:t>SELECT *</w:t>
+      </w:r>
+      <w:r>
+        <w:br/>
+      </w:r>
+      <w:r>
+        <w:rPr>
+          <w:rFonts w:ascii="Consolas" w:hAnsi="Consolas" w:eastAsia="Consolas"/>
+          <w:sz w:val="19"/>
+        </w:rPr>
+        <w:t>FROM BO.CATEGORIES;</w:t>
+      </w:r>
+      <w:r>
+        <w:br/>
+      </w:r>
+      <w:r>
+        <w:rPr>
+          <w:rFonts w:ascii="Consolas" w:hAnsi="Consolas" w:eastAsia="Consolas"/>
+          <w:sz w:val="19"/>
+        </w:rPr>
+      </w:r>
+      <w:r>
+        <w:br/>
+      </w:r>
+      <w:r>
+        <w:rPr>
+          <w:rFonts w:ascii="Consolas" w:hAnsi="Consolas" w:eastAsia="Consolas"/>
+          <w:sz w:val="19"/>
+        </w:rPr>
+        <w:t>SELECT COUNT(*) AS BEFORE_DROP_CNT</w:t>
+      </w:r>
+      <w:r>
+        <w:br/>
+      </w:r>
+      <w:r>
+        <w:rPr>
+          <w:rFonts w:ascii="Consolas" w:hAnsi="Consolas" w:eastAsia="Consolas"/>
+          <w:sz w:val="19"/>
+        </w:rPr>
+        <w:t>FROM BO.FB_DROP_TEST;</w:t>
+      </w:r>
+      <w:r>
+        <w:br/>
+      </w:r>
+      <w:r>
+        <w:rPr>
+          <w:rFonts w:ascii="Consolas" w:hAnsi="Consolas" w:eastAsia="Consolas"/>
+          <w:sz w:val="19"/>
+        </w:rPr>
+      </w:r>
+      <w:r>
+        <w:br/>
+      </w:r>
+      <w:r>
+        <w:rPr>
+          <w:rFonts w:ascii="Consolas" w:hAnsi="Consolas" w:eastAsia="Consolas"/>
+          <w:sz w:val="19"/>
+        </w:rPr>
+        <w:t>DROP TABLE BO.FB_DROP_TEST;</w:t>
+      </w:r>
+      <w:r>
+        <w:br/>
+      </w:r>
+      <w:r>
+        <w:rPr>
+          <w:rFonts w:ascii="Consolas" w:hAnsi="Consolas" w:eastAsia="Consolas"/>
+          <w:sz w:val="19"/>
+        </w:rPr>
+      </w:r>
+      <w:r>
+        <w:br/>
+      </w:r>
+      <w:r>
+        <w:rPr>
+          <w:rFonts w:ascii="Consolas" w:hAnsi="Consolas" w:eastAsia="Consolas"/>
+          <w:sz w:val="19"/>
+        </w:rPr>
+        <w:t>SELECT ORIGINAL_NAME,</w:t>
+      </w:r>
+      <w:r>
+        <w:br/>
+      </w:r>
+      <w:r>
+        <w:rPr>
+          <w:rFonts w:ascii="Consolas" w:hAnsi="Consolas" w:eastAsia="Consolas"/>
+          <w:sz w:val="19"/>
+        </w:rPr>
+        <w:t xml:space="preserve">       OBJECT_NAME,</w:t>
+      </w:r>
+      <w:r>
+        <w:br/>
+      </w:r>
+      <w:r>
+        <w:rPr>
+          <w:rFonts w:ascii="Consolas" w:hAnsi="Consolas" w:eastAsia="Consolas"/>
+          <w:sz w:val="19"/>
+        </w:rPr>
+        <w:t xml:space="preserve">       TYPE,</w:t>
+      </w:r>
+      <w:r>
+        <w:br/>
+      </w:r>
+      <w:r>
+        <w:rPr>
+          <w:rFonts w:ascii="Consolas" w:hAnsi="Consolas" w:eastAsia="Consolas"/>
+          <w:sz w:val="19"/>
+        </w:rPr>
+        <w:t xml:space="preserve">       DROPTIME,</w:t>
+      </w:r>
+      <w:r>
+        <w:br/>
+      </w:r>
+      <w:r>
+        <w:rPr>
+          <w:rFonts w:ascii="Consolas" w:hAnsi="Consolas" w:eastAsia="Consolas"/>
+          <w:sz w:val="19"/>
+        </w:rPr>
+        <w:t xml:space="preserve">       CAN_UNDROP</w:t>
+      </w:r>
+      <w:r>
+        <w:br/>
+      </w:r>
+      <w:r>
+        <w:rPr>
+          <w:rFonts w:ascii="Consolas" w:hAnsi="Consolas" w:eastAsia="Consolas"/>
+          <w:sz w:val="19"/>
+        </w:rPr>
+        <w:t>FROM USER_RECYCLEBIN</w:t>
+      </w:r>
+      <w:r>
+        <w:br/>
+      </w:r>
+      <w:r>
+        <w:rPr>
+          <w:rFonts w:ascii="Consolas" w:hAnsi="Consolas" w:eastAsia="Consolas"/>
+          <w:sz w:val="19"/>
+        </w:rPr>
+        <w:t>WHERE ORIGINAL_NAME = 'FB_DROP_TEST';</w:t>
+      </w:r>
+    </w:p>
+    <w:p>
+      <w:pPr>
+        <w:jc w:val="center"/>
+        <w:shd w:val="clear" w:fill="FBEAE7"/>
+      </w:pPr>
+      <w:r>
+        <w:rPr>
+          <w:i/>
+          <w:color w:val="B03A2E"/>
+          <w:sz w:val="20"/>
+        </w:rPr>
+        <w:t>［ 재실행 후 이 위치에 실행 화면 삽입 ］</w:t>
+      </w:r>
+    </w:p>
+    <w:p>
+      <w:pPr>
+        <w:pStyle w:val="a5"/>
+        <w:jc w:val="center"/>
+      </w:pPr>
+      <w:r>
+        <w:t>Figure 3-</w:t>
+      </w:r>
+      <w:r>
+        <w:fldChar w:fldCharType="begin"/>
+      </w:r>
+      <w:r>
+        <w:instrText xml:space="preserve"> SEQ Figure \* ARABIC </w:instrText>
+      </w:r>
+      <w:r>
+        <w:fldChar w:fldCharType="separate"/>
+      </w:r>
+      <w:r>
+        <w:t>20</w:t>
+      </w:r>
+      <w:r>
+        <w:fldChar w:fldCharType="end"/>
+      </w:r>
+      <w:r>
+        <w:t>. Case 4B FB_DROP_TEST 생성·DROP 및 Recycle Bin 확인</w:t>
+      </w:r>
+    </w:p>
+    <w:p>
+      <w:pPr>
+        <w:spacing w:after="80"/>
+        <w:ind w:left="288"/>
+        <w:shd w:val="clear" w:fill="F2F3F5"/>
+      </w:pPr>
+      <w:r>
+        <w:rPr>
+          <w:rFonts w:ascii="Consolas" w:hAnsi="Consolas" w:eastAsia="Consolas"/>
+          <w:sz w:val="19"/>
+        </w:rPr>
+        <w:t>FLASHBACK TABLE BO.FB_DROP_TEST</w:t>
+      </w:r>
+      <w:r>
+        <w:br/>
+      </w:r>
+      <w:r>
+        <w:rPr>
+          <w:rFonts w:ascii="Consolas" w:hAnsi="Consolas" w:eastAsia="Consolas"/>
+          <w:sz w:val="19"/>
+        </w:rPr>
+        <w:t>TO BEFORE DROP;</w:t>
+      </w:r>
+      <w:r>
+        <w:br/>
+      </w:r>
+      <w:r>
+        <w:rPr>
+          <w:rFonts w:ascii="Consolas" w:hAnsi="Consolas" w:eastAsia="Consolas"/>
+          <w:sz w:val="19"/>
+        </w:rPr>
+      </w:r>
+      <w:r>
+        <w:br/>
+      </w:r>
+      <w:r>
+        <w:rPr>
+          <w:rFonts w:ascii="Consolas" w:hAnsi="Consolas" w:eastAsia="Consolas"/>
+          <w:sz w:val="19"/>
+        </w:rPr>
+        <w:t>SELECT COUNT(*) AS AFTER_FLASHBACK_CNT</w:t>
+      </w:r>
+      <w:r>
+        <w:br/>
+      </w:r>
+      <w:r>
+        <w:rPr>
+          <w:rFonts w:ascii="Consolas" w:hAnsi="Consolas" w:eastAsia="Consolas"/>
+          <w:sz w:val="19"/>
+        </w:rPr>
+        <w:t>FROM BO.FB_DROP_TEST;</w:t>
+      </w:r>
+      <w:r>
+        <w:br/>
+      </w:r>
+      <w:r>
+        <w:rPr>
+          <w:rFonts w:ascii="Consolas" w:hAnsi="Consolas" w:eastAsia="Consolas"/>
+          <w:sz w:val="19"/>
+        </w:rPr>
+      </w:r>
+      <w:r>
+        <w:br/>
+      </w:r>
+      <w:r>
+        <w:rPr>
+          <w:rFonts w:ascii="Consolas" w:hAnsi="Consolas" w:eastAsia="Consolas"/>
+          <w:sz w:val="19"/>
+        </w:rPr>
+        <w:t>SELECT OBJECT_NAME,</w:t>
+      </w:r>
+      <w:r>
+        <w:br/>
+      </w:r>
+      <w:r>
+        <w:rPr>
+          <w:rFonts w:ascii="Consolas" w:hAnsi="Consolas" w:eastAsia="Consolas"/>
+          <w:sz w:val="19"/>
+        </w:rPr>
+        <w:t xml:space="preserve">       OBJECT_TYPE,</w:t>
+      </w:r>
+      <w:r>
+        <w:br/>
+      </w:r>
+      <w:r>
+        <w:rPr>
+          <w:rFonts w:ascii="Consolas" w:hAnsi="Consolas" w:eastAsia="Consolas"/>
+          <w:sz w:val="19"/>
+        </w:rPr>
+        <w:t xml:space="preserve">       STATUS</w:t>
+      </w:r>
+      <w:r>
+        <w:br/>
+      </w:r>
+      <w:r>
+        <w:rPr>
+          <w:rFonts w:ascii="Consolas" w:hAnsi="Consolas" w:eastAsia="Consolas"/>
+          <w:sz w:val="19"/>
+        </w:rPr>
+        <w:t>FROM USER_OBJECTS</w:t>
+      </w:r>
+      <w:r>
+        <w:br/>
+      </w:r>
+      <w:r>
+        <w:rPr>
+          <w:rFonts w:ascii="Consolas" w:hAnsi="Consolas" w:eastAsia="Consolas"/>
+          <w:sz w:val="19"/>
+        </w:rPr>
+        <w:t>WHERE OBJECT_NAME LIKE 'FB_DROP_TEST%';</w:t>
+      </w:r>
+    </w:p>
+    <w:p>
+      <w:pPr>
+        <w:jc w:val="center"/>
+        <w:shd w:val="clear" w:fill="FBEAE7"/>
+      </w:pPr>
+      <w:r>
+        <w:rPr>
+          <w:i/>
+          <w:color w:val="B03A2E"/>
+          <w:sz w:val="20"/>
+        </w:rPr>
+        <w:t>［ 재실행 후 이 위치에 실행 화면 삽입 ］</w:t>
+      </w:r>
+    </w:p>
+    <w:p>
+      <w:pPr>
+        <w:pStyle w:val="a5"/>
+        <w:jc w:val="center"/>
+      </w:pPr>
+      <w:r>
+        <w:t>Figure 3-</w:t>
+      </w:r>
+      <w:r>
+        <w:fldChar w:fldCharType="begin"/>
+      </w:r>
+      <w:r>
+        <w:instrText xml:space="preserve"> SEQ Figure \* ARABIC </w:instrText>
+      </w:r>
+      <w:r>
+        <w:fldChar w:fldCharType="separate"/>
+      </w:r>
+      <w:r>
+        <w:t>21</w:t>
+      </w:r>
+      <w:r>
+        <w:fldChar w:fldCharType="end"/>
+      </w:r>
+      <w:r>
+        <w:t>. Case 4B Flashback Drop 수행 및 FB_DROP_TEST 복구 결과</w:t>
+      </w:r>
+    </w:p>
+    <w:p>
+      <w:r>
+        <w:t>최종 확인 후 테스트 테이블은 정리한다.</w:t>
+      </w:r>
+    </w:p>
+    <w:p>
+      <w:pPr>
+        <w:spacing w:after="80"/>
+        <w:ind w:left="288"/>
+        <w:shd w:val="clear" w:fill="F2F3F5"/>
+      </w:pPr>
+      <w:r>
+        <w:rPr>
+          <w:rFonts w:ascii="Consolas" w:hAnsi="Consolas" w:eastAsia="Consolas"/>
+          <w:sz w:val="19"/>
+        </w:rPr>
+        <w:t>DROP TABLE BO.FB_DROP_TEST PURGE;</w:t>
+      </w:r>
+    </w:p>
+    <w:p>
+      <w:r>
+        <w:t>Flashback Drop은 Recycle Bin에 남은 DROP 객체 자신과 관련 인덱스를 복구하지만, CASCADE CONSTRAINTS로 다른 테이블에서 제거된 FK까지 자동 복원하지 않는다. 따라서 업무 테이블 복구 후에는 참조 제약과 권한 등 종속 객체를 별도로 확인해야 한다.</w:t>
+      </w:r>
+    </w:p>
+    <w:p>
+      <w:r>
+        <w:t>※ 이 한계는 초기 CATEGORIES 실험에서 실제로 확인되었다. 업무 테이블 CATEGORIES를 CASCADE CONSTRAINTS로 DROP한 뒤 Flashback Drop으로 복구했을 때, 함께 제거된 외부 FK(PRODUCTS_R1)가 자동 복구되지 않아 DBA_CONSTRAINTS AS OF TIMESTAMP로 이전 정의를 확인하여 수동 재생성해야 했다. Flashback Drop의 복구 범위 한계를 보여주는 중요한 근거이므로 해당 실행 화면을 Appendix A-4에 보존하였다.</w:t>
+      </w:r>
+    </w:p>
+    <w:p>
+      <w:pPr>
+        <w:pStyle w:val="3"/>
+      </w:pPr>
+      <w:r>
+        <w:t>③ Case 5 — Recycle Bin 부재 시 Original Export 덤프 복구</w:t>
+      </w:r>
+    </w:p>
+    <w:p>
+      <w:r>
+        <w:t>BO_TEST가 유실된 상황에서 DBA_RECYCLEBIN 조회 결과가 없어 Flashback Drop으로 복구할 수 없었다. impdp 실행 시 ORA-39143이 발생하여 덤프가 Data Pump 형식이 아니라 Original Export(exp) 형식임을 확인하고, imp 유틸리티로 복구하였다.</w:t>
+      </w:r>
+    </w:p>
+    <w:p>
+      <w:pPr>
+        <w:spacing w:after="80"/>
+        <w:ind w:left="288"/>
+        <w:shd w:val="clear" w:fill="F2F3F5"/>
+      </w:pPr>
+      <w:r>
+        <w:rPr>
+          <w:rFonts w:ascii="Consolas" w:hAnsi="Consolas" w:eastAsia="Consolas"/>
+          <w:sz w:val="19"/>
+        </w:rPr>
+        <w:t>$ impdp ...        -- ORA-39143 발생 → Data Pump 덤프 아님</w:t>
+      </w:r>
+      <w:r>
+        <w:br/>
+      </w:r>
+      <w:r>
+        <w:rPr>
+          <w:rFonts w:ascii="Consolas" w:hAnsi="Consolas" w:eastAsia="Consolas"/>
+          <w:sz w:val="19"/>
+        </w:rPr>
+        <w:t>$ imp bo/**** FILE=bo_test.dmp FROMUSER=bo TOUSER=bo</w:t>
+      </w:r>
+      <w:r>
+        <w:br/>
+      </w:r>
+      <w:r>
+        <w:rPr>
+          <w:rFonts w:ascii="Consolas" w:hAnsi="Consolas" w:eastAsia="Consolas"/>
+          <w:sz w:val="19"/>
+        </w:rPr>
+        <w:t>SQL&gt; SELECT COUNT(*) FROM BO.BO_TEST;               -- 1,000,000건</w:t>
+      </w:r>
+      <w:r>
+        <w:br/>
+      </w:r>
+      <w:r>
+        <w:rPr>
+          <w:rFonts w:ascii="Consolas" w:hAnsi="Consolas" w:eastAsia="Consolas"/>
+          <w:sz w:val="19"/>
+        </w:rPr>
+        <w:t>SQL&gt; SELECT INDEX_NAME, STATUS FROM DBA_INDEXES</w:t>
+      </w:r>
+      <w:r>
+        <w:br/>
+      </w:r>
+      <w:r>
+        <w:rPr>
+          <w:rFonts w:ascii="Consolas" w:hAnsi="Consolas" w:eastAsia="Consolas"/>
+          <w:sz w:val="19"/>
+        </w:rPr>
+        <w:t xml:space="preserve">      WHERE TABLE_NAME='BO_TEST';                   -- 복합 인덱스 VALID</w:t>
+      </w:r>
+      <w:r>
+        <w:br/>
+      </w:r>
+      <w:r>
+        <w:rPr>
+          <w:rFonts w:ascii="Consolas" w:hAnsi="Consolas" w:eastAsia="Consolas"/>
+          <w:sz w:val="19"/>
+        </w:rPr>
+        <w:t>SQL&gt; SELECT INDEX_NAME, STATUS FROM DBA_INDEXES</w:t>
+      </w:r>
+      <w:r>
+        <w:br/>
+      </w:r>
+      <w:r>
+        <w:rPr>
+          <w:rFonts w:ascii="Consolas" w:hAnsi="Consolas" w:eastAsia="Consolas"/>
+          <w:sz w:val="19"/>
+        </w:rPr>
+        <w:t xml:space="preserve">      WHERE INDEX_NAME='TBL_IDX01';                 -- TBL_IDX01 복구 확인</w:t>
+      </w:r>
+    </w:p>
+    <w:p>
+      <w:pPr>
+        <w:jc w:val="center"/>
+        <w:shd w:val="clear" w:fill="FBEAE7"/>
+      </w:pPr>
+      <w:r>
+        <w:rPr>
+          <w:i/>
+          <w:color w:val="B03A2E"/>
+          <w:sz w:val="20"/>
+        </w:rPr>
+        <w:t>［ 재실행 후 이 위치에 실행 화면 삽입 ］</w:t>
+      </w:r>
+    </w:p>
+    <w:p>
+      <w:pPr>
+        <w:pStyle w:val="a5"/>
+        <w:jc w:val="center"/>
+      </w:pPr>
+      <w:r>
+        <w:t>Figure 3-</w:t>
+      </w:r>
+      <w:r>
+        <w:fldChar w:fldCharType="begin"/>
+      </w:r>
+      <w:r>
+        <w:instrText xml:space="preserve"> SEQ Figure \* ARABIC </w:instrText>
+      </w:r>
+      <w:r>
+        <w:fldChar w:fldCharType="separate"/>
+      </w:r>
+      <w:r>
+        <w:t>22</w:t>
+      </w:r>
+      <w:r>
+        <w:fldChar w:fldCharType="end"/>
+      </w:r>
+      <w:r>
+        <w:t>. Case 5 Recycle Bin 부재 및 impdp ORA-39143 확인</w:t>
+      </w:r>
+    </w:p>
+    <w:p>
+      <w:pPr>
+        <w:jc w:val="center"/>
+        <w:shd w:val="clear" w:fill="FBEAE7"/>
+      </w:pPr>
+      <w:r>
+        <w:rPr>
+          <w:i/>
+          <w:color w:val="B03A2E"/>
+          <w:sz w:val="20"/>
+        </w:rPr>
+        <w:t>［ 재실행 후 이 위치에 실행 화면 삽입 ］</w:t>
+      </w:r>
+    </w:p>
+    <w:p>
+      <w:pPr>
+        <w:pStyle w:val="a5"/>
+        <w:jc w:val="center"/>
+      </w:pPr>
+      <w:r>
+        <w:t>Figure 3-</w:t>
+      </w:r>
+      <w:r>
+        <w:fldChar w:fldCharType="begin"/>
+      </w:r>
+      <w:r>
+        <w:instrText xml:space="preserve"> SEQ Figure \* ARABIC </w:instrText>
+      </w:r>
+      <w:r>
+        <w:fldChar w:fldCharType="separate"/>
+      </w:r>
+      <w:r>
+        <w:t>23</w:t>
+      </w:r>
+      <w:r>
+        <w:fldChar w:fldCharType="end"/>
+      </w:r>
+      <w:r>
+        <w:t>. Case 5 Original Export(imp) 유틸리티 수행 결과</w:t>
+      </w:r>
+    </w:p>
+    <w:p>
+      <w:pPr>
+        <w:jc w:val="center"/>
+        <w:shd w:val="clear" w:fill="FBEAE7"/>
+      </w:pPr>
+      <w:r>
+        <w:rPr>
+          <w:i/>
+          <w:color w:val="B03A2E"/>
+          <w:sz w:val="20"/>
+        </w:rPr>
+        <w:t>［ 재실행 후 이 위치에 실행 화면 삽입 ］</w:t>
+      </w:r>
+    </w:p>
+    <w:p>
+      <w:pPr>
+        <w:pStyle w:val="a5"/>
+        <w:jc w:val="center"/>
+      </w:pPr>
+      <w:r>
+        <w:t>Figure 3-</w:t>
+      </w:r>
+      <w:r>
+        <w:fldChar w:fldCharType="begin"/>
+      </w:r>
+      <w:r>
+        <w:instrText xml:space="preserve"> SEQ Figure \* ARABIC </w:instrText>
+      </w:r>
+      <w:r>
+        <w:fldChar w:fldCharType="separate"/>
+      </w:r>
+      <w:r>
+        <w:t>24</w:t>
+      </w:r>
+      <w:r>
+        <w:fldChar w:fldCharType="end"/>
+      </w:r>
+      <w:r>
+        <w:t>. Case 5 BO_TEST 1,000,000건·복합 인덱스 VALID·TBL_IDX01 복구 검증</w:t>
+      </w:r>
+    </w:p>
+    <w:p>
+      <w:r>
+        <w:t>실행 중 IMP-00403 권한 관련 경고가 발생했으나, 대상 테이블과 인덱스의 데이터·상태 검증 결과 복구 대상 객체는 정상적으로 복원되었다. 다만 운영 환경에서는 경고 대상 권한을 별도로 점검해야 한다.</w:t>
+      </w:r>
+    </w:p>
+    <w:p>
+      <w:r>
+        <w:t>Recycle Bin과 Flashback으로 복구할 수 없는 경우 사전 Export 덤프가 최후의 복구 수단이 될 수 있었다. 또한 덤프 형식에 따라 impdp와 imp를 구분해야 하며, 복구 완료 후에는 데이터 건수와 인덱스 상태를 함께 확인해야 한다.</w:t>
+      </w:r>
+    </w:p>
+    <w:p>
+      <w:pPr>
+        <w:pStyle w:val="2"/>
+      </w:pPr>
+      <w:r>
+        <w:t>7) 종합 검증 및 환경 정리</w:t>
+      </w:r>
+    </w:p>
+    <w:p>
+      <w:pPr>
+        <w:pStyle w:val="3"/>
+      </w:pPr>
+      <w:r>
+        <w:t>① RMAN 물리적 무결성 검증</w:t>
+      </w:r>
+    </w:p>
+    <w:p>
+      <w:r>
+        <w:t>Case 1~3에서 복구한 데이터파일과 블록을 포함해 데이터베이스 전체의 물리적·논리적 블록 상태를 검증하였다.</w:t>
+      </w:r>
+    </w:p>
+    <w:p>
+      <w:pPr>
+        <w:spacing w:after="80"/>
+        <w:ind w:left="288"/>
+        <w:shd w:val="clear" w:fill="F2F3F5"/>
+      </w:pPr>
+      <w:r>
+        <w:rPr>
+          <w:rFonts w:ascii="Consolas" w:hAnsi="Consolas" w:eastAsia="Consolas"/>
+          <w:sz w:val="19"/>
+        </w:rPr>
+        <w:t>RMAN&gt; VALIDATE CHECK LOGICAL DATABASE;</w:t>
+      </w:r>
+      <w:r>
+        <w:br/>
+      </w:r>
+      <w:r>
+        <w:rPr>
+          <w:rFonts w:ascii="Consolas" w:hAnsi="Consolas" w:eastAsia="Consolas"/>
+          <w:sz w:val="19"/>
+        </w:rPr>
+        <w:t>SQL&gt; SELECT * FROM V$DATABASE_BLOCK_CORRUPTION;</w:t>
+      </w:r>
+    </w:p>
+    <w:p>
+      <w:pPr>
+        <w:jc w:val="center"/>
+      </w:pPr>
+      <w:r>
+        <w:drawing>
+          <wp:inline xmlns:a="http://schemas.openxmlformats.org/drawingml/2006/main" xmlns:pic="http://schemas.openxmlformats.org/drawingml/2006/picture">
+            <wp:extent cx="4803799" cy="1555702"/>
+            <wp:docPr id="42" name="Picture 42"/>
+            <wp:cNvGraphicFramePr>
+              <a:graphicFrameLocks noChangeAspect="1"/>
+            </wp:cNvGraphicFramePr>
+            <a:graphic>
+              <a:graphicData uri="http://schemas.openxmlformats.org/drawingml/2006/picture">
+                <pic:pic>
+                  <pic:nvPicPr>
+                    <pic:cNvPr id="0" name="image.png"/>
+                    <pic:cNvPicPr/>
+                  </pic:nvPicPr>
+                  <pic:blipFill>
+                    <a:blip r:embed="rId62"/>
+                    <a:stretch>
+                      <a:fillRect/>
+                    </a:stretch>
+                  </pic:blipFill>
+                  <pic:spPr>
+                    <a:xfrm>
+                      <a:off x="0" y="0"/>
+                      <a:ext cx="4803799" cy="1555702"/>
+                    </a:xfrm>
+                    <a:prstGeom prst="rect"/>
+                  </pic:spPr>
+                </pic:pic>
+              </a:graphicData>
+            </a:graphic>
+          </wp:inline>
+        </w:drawing>
+      </w:r>
+    </w:p>
+    <w:p>
+      <w:pPr>
+        <w:jc w:val="center"/>
+      </w:pPr>
+      <w:r>
+        <w:drawing>
+          <wp:inline xmlns:a="http://schemas.openxmlformats.org/drawingml/2006/main" xmlns:pic="http://schemas.openxmlformats.org/drawingml/2006/picture">
+            <wp:extent cx="4869766" cy="3511664"/>
+            <wp:docPr id="43" name="Picture 43"/>
+            <wp:cNvGraphicFramePr>
+              <a:graphicFrameLocks noChangeAspect="1"/>
+            </wp:cNvGraphicFramePr>
+            <a:graphic>
+              <a:graphicData uri="http://schemas.openxmlformats.org/drawingml/2006/picture">
+                <pic:pic>
+                  <pic:nvPicPr>
+                    <pic:cNvPr id="0" name="image.png"/>
+                    <pic:cNvPicPr/>
+                  </pic:nvPicPr>
+                  <pic:blipFill>
+                    <a:blip r:embed="rId63"/>
+                    <a:stretch>
+                      <a:fillRect/>
+                    </a:stretch>
+                  </pic:blipFill>
+                  <pic:spPr>
+                    <a:xfrm>
+                      <a:off x="0" y="0"/>
+                      <a:ext cx="4869766" cy="3511664"/>
+                    </a:xfrm>
+                    <a:prstGeom prst="rect"/>
+                  </pic:spPr>
+                </pic:pic>
+              </a:graphicData>
+            </a:graphic>
+          </wp:inline>
+        </w:drawing>
+      </w:r>
+    </w:p>
+    <w:p>
+      <w:pPr>
+        <w:jc w:val="center"/>
+      </w:pPr>
+      <w:r>
+        <w:drawing>
+          <wp:inline xmlns:a="http://schemas.openxmlformats.org/drawingml/2006/main" xmlns:pic="http://schemas.openxmlformats.org/drawingml/2006/picture">
+            <wp:extent cx="4835501" cy="4432543"/>
+            <wp:docPr id="44" name="Picture 44"/>
+            <wp:cNvGraphicFramePr>
+              <a:graphicFrameLocks noChangeAspect="1"/>
+            </wp:cNvGraphicFramePr>
+            <a:graphic>
+              <a:graphicData uri="http://schemas.openxmlformats.org/drawingml/2006/picture">
+                <pic:pic>
+                  <pic:nvPicPr>
+                    <pic:cNvPr id="0" name="image.png"/>
+                    <pic:cNvPicPr/>
+                  </pic:nvPicPr>
+                  <pic:blipFill>
+                    <a:blip r:embed="rId64"/>
+                    <a:stretch>
+                      <a:fillRect/>
+                    </a:stretch>
+                  </pic:blipFill>
+                  <pic:spPr>
+                    <a:xfrm>
+                      <a:off x="0" y="0"/>
+                      <a:ext cx="4835501" cy="4432543"/>
+                    </a:xfrm>
+                    <a:prstGeom prst="rect"/>
+                  </pic:spPr>
+                </pic:pic>
+              </a:graphicData>
+            </a:graphic>
+          </wp:inline>
+        </w:drawing>
+      </w:r>
+    </w:p>
+    <w:p>
+      <w:pPr>
+        <w:jc w:val="center"/>
+      </w:pPr>
+      <w:r>
+        <w:drawing>
+          <wp:inline xmlns:a="http://schemas.openxmlformats.org/drawingml/2006/main" xmlns:pic="http://schemas.openxmlformats.org/drawingml/2006/picture">
+            <wp:extent cx="4813495" cy="1201767"/>
+            <wp:docPr id="45" name="Picture 45"/>
+            <wp:cNvGraphicFramePr>
+              <a:graphicFrameLocks noChangeAspect="1"/>
+            </wp:cNvGraphicFramePr>
+            <a:graphic>
+              <a:graphicData uri="http://schemas.openxmlformats.org/drawingml/2006/picture">
+                <pic:pic>
+                  <pic:nvPicPr>
+                    <pic:cNvPr id="0" name="image.png"/>
+                    <pic:cNvPicPr/>
+                  </pic:nvPicPr>
+                  <pic:blipFill>
+                    <a:blip r:embed="rId65"/>
+                    <a:stretch>
+                      <a:fillRect/>
+                    </a:stretch>
+                  </pic:blipFill>
+                  <pic:spPr>
+                    <a:xfrm>
+                      <a:off x="0" y="0"/>
+                      <a:ext cx="4813495" cy="1201767"/>
+                    </a:xfrm>
+                    <a:prstGeom prst="rect"/>
+                  </pic:spPr>
+                </pic:pic>
+              </a:graphicData>
+            </a:graphic>
+          </wp:inline>
+        </w:drawing>
+      </w:r>
+    </w:p>
+    <w:p>
+      <w:pPr>
+        <w:pStyle w:val="a5"/>
+        <w:jc w:val="center"/>
+      </w:pPr>
+      <w:r>
+        <w:t>Figure 3-</w:t>
+      </w:r>
+      <w:r>
+        <w:fldChar w:fldCharType="begin"/>
+      </w:r>
+      <w:r>
+        <w:instrText xml:space="preserve"> SEQ Figure \* ARABIC </w:instrText>
+      </w:r>
+      <w:r>
+        <w:fldChar w:fldCharType="separate"/>
+      </w:r>
+      <w:r>
+        <w:t>25</w:t>
+      </w:r>
+      <w:r>
+        <w:fldChar w:fldCharType="end"/>
+      </w:r>
+      <w:r>
+        <w:t>. 모든 물리적 복구 완료 후 RMAN VALIDATE 및 손상 블록 0건 확인</w:t>
+      </w:r>
+    </w:p>
+    <w:p>
+      <w:pPr>
+        <w:pStyle w:val="3"/>
+      </w:pPr>
+      <w:r>
+        <w:t>② 논리적 복구 결과 검증</w:t>
+      </w:r>
+    </w:p>
+    <w:tbl>
+      <w:tblPr>
+        <w:tblStyle w:val="a4"/>
+        <w:tblW w:type="auto" w:w="0"/>
+        <w:tblLook w:firstColumn="1" w:firstRow="1" w:lastColumn="0" w:lastRow="0" w:noHBand="0" w:noVBand="1" w:val="04A0"/>
+      </w:tblPr>
+      <w:tblGrid>
+        <w:gridCol w:w="3009"/>
+        <w:gridCol w:w="3009"/>
+        <w:gridCol w:w="3009"/>
+      </w:tblGrid>
+      <w:tr>
+        <w:tc>
+          <w:tcPr>
+            <w:tcW w:type="dxa" w:w="3009"/>
+          </w:tcPr>
+          <w:p>
+            <w:r/>
+            <w:r>
+              <w:rPr>
+                <w:b/>
+                <w:sz w:val="19"/>
+              </w:rPr>
+              <w:t>검증 대상</w:t>
+            </w:r>
+          </w:p>
+        </w:tc>
+        <w:tc>
+          <w:tcPr>
+            <w:tcW w:type="dxa" w:w="3009"/>
+          </w:tcPr>
+          <w:p>
+            <w:r/>
+            <w:r>
+              <w:rPr>
+                <w:b/>
+                <w:sz w:val="19"/>
+              </w:rPr>
+              <w:t>확인 항목</w:t>
+            </w:r>
+          </w:p>
+        </w:tc>
+        <w:tc>
+          <w:tcPr>
+            <w:tcW w:type="dxa" w:w="3009"/>
+          </w:tcPr>
+          <w:p>
+            <w:r/>
+            <w:r>
+              <w:rPr>
+                <w:b/>
+                <w:sz w:val="19"/>
+              </w:rPr>
+              <w:t>정상 기준</w:t>
+            </w:r>
+          </w:p>
+        </w:tc>
+      </w:tr>
+      <w:tr>
+        <w:tc>
+          <w:tcPr>
+            <w:tcW w:type="dxa" w:w="3009"/>
+          </w:tcPr>
+          <w:p>
+            <w:r/>
+            <w:r>
+              <w:rPr>
+                <w:sz w:val="19"/>
+              </w:rPr>
+              <w:t>CUST_CONTACTS</w:t>
+            </w:r>
+          </w:p>
+        </w:tc>
+        <w:tc>
+          <w:tcPr>
+            <w:tcW w:type="dxa" w:w="3009"/>
+          </w:tcPr>
+          <w:p>
+            <w:r/>
+            <w:r>
+              <w:rPr>
+                <w:sz w:val="19"/>
+              </w:rPr>
+              <w:t>사고 전 건수 복구</w:t>
+            </w:r>
+          </w:p>
+        </w:tc>
+        <w:tc>
+          <w:tcPr>
+            <w:tcW w:type="dxa" w:w="3009"/>
+          </w:tcPr>
+          <w:p>
+            <w:r/>
+            <w:r>
+              <w:rPr>
+                <w:sz w:val="19"/>
+              </w:rPr>
+              <w:t>원래 건수와 동일</w:t>
+            </w:r>
+          </w:p>
+        </w:tc>
+      </w:tr>
+      <w:tr>
+        <w:tc>
+          <w:tcPr>
+            <w:tcW w:type="dxa" w:w="3009"/>
+          </w:tcPr>
+          <w:p>
+            <w:r/>
+            <w:r>
+              <w:rPr>
+                <w:sz w:val="19"/>
+              </w:rPr>
+              <w:t>FB_DROP_TEST</w:t>
+            </w:r>
+          </w:p>
+        </w:tc>
+        <w:tc>
+          <w:tcPr>
+            <w:tcW w:type="dxa" w:w="3009"/>
+          </w:tcPr>
+          <w:p>
+            <w:r/>
+            <w:r>
+              <w:rPr>
+                <w:sz w:val="19"/>
+              </w:rPr>
+              <w:t>복구 후 데이터 건수</w:t>
+            </w:r>
+          </w:p>
+        </w:tc>
+        <w:tc>
+          <w:tcPr>
+            <w:tcW w:type="dxa" w:w="3009"/>
+          </w:tcPr>
+          <w:p>
+            <w:r/>
+            <w:r>
+              <w:rPr>
+                <w:sz w:val="19"/>
+              </w:rPr>
+              <w:t>생성 직후 건수와 동일</w:t>
+            </w:r>
+          </w:p>
+        </w:tc>
+      </w:tr>
+      <w:tr>
+        <w:tc>
+          <w:tcPr>
+            <w:tcW w:type="dxa" w:w="3009"/>
+          </w:tcPr>
+          <w:p>
+            <w:r/>
+            <w:r>
+              <w:rPr>
+                <w:sz w:val="19"/>
+              </w:rPr>
+              <w:t>BO_TEST</w:t>
+            </w:r>
+          </w:p>
+        </w:tc>
+        <w:tc>
+          <w:tcPr>
+            <w:tcW w:type="dxa" w:w="3009"/>
+          </w:tcPr>
+          <w:p>
+            <w:r/>
+            <w:r>
+              <w:rPr>
+                <w:sz w:val="19"/>
+              </w:rPr>
+              <w:t>복구 건수</w:t>
+            </w:r>
+          </w:p>
+        </w:tc>
+        <w:tc>
+          <w:tcPr>
+            <w:tcW w:type="dxa" w:w="3009"/>
+          </w:tcPr>
+          <w:p>
+            <w:r/>
+            <w:r>
+              <w:rPr>
+                <w:sz w:val="19"/>
+              </w:rPr>
+              <w:t>1,000,000건</w:t>
+            </w:r>
+          </w:p>
+        </w:tc>
+      </w:tr>
+      <w:tr>
+        <w:tc>
+          <w:tcPr>
+            <w:tcW w:type="dxa" w:w="3009"/>
+          </w:tcPr>
+          <w:p>
+            <w:r/>
+            <w:r>
+              <w:rPr>
+                <w:sz w:val="19"/>
+              </w:rPr>
+              <w:t>BO_TEST 인덱스</w:t>
+            </w:r>
+          </w:p>
+        </w:tc>
+        <w:tc>
+          <w:tcPr>
+            <w:tcW w:type="dxa" w:w="3009"/>
+          </w:tcPr>
+          <w:p>
+            <w:r/>
+            <w:r>
+              <w:rPr>
+                <w:sz w:val="19"/>
+              </w:rPr>
+              <w:t>STATUS</w:t>
+            </w:r>
+          </w:p>
+        </w:tc>
+        <w:tc>
+          <w:tcPr>
+            <w:tcW w:type="dxa" w:w="3009"/>
+          </w:tcPr>
+          <w:p>
+            <w:r/>
+            <w:r>
+              <w:rPr>
+                <w:sz w:val="19"/>
+              </w:rPr>
+              <w:t>VALID</w:t>
+            </w:r>
+          </w:p>
+        </w:tc>
+      </w:tr>
+      <w:tr>
+        <w:tc>
+          <w:tcPr>
+            <w:tcW w:type="dxa" w:w="3009"/>
+          </w:tcPr>
+          <w:p>
+            <w:r/>
+            <w:r>
+              <w:rPr>
+                <w:sz w:val="19"/>
+              </w:rPr>
+              <w:t>관련 PK·FK</w:t>
+            </w:r>
+          </w:p>
+        </w:tc>
+        <w:tc>
+          <w:tcPr>
+            <w:tcW w:type="dxa" w:w="3009"/>
+          </w:tcPr>
+          <w:p>
+            <w:r/>
+            <w:r>
+              <w:rPr>
+                <w:sz w:val="19"/>
+              </w:rPr>
+              <w:t>존재·상태</w:t>
+            </w:r>
+          </w:p>
+        </w:tc>
+        <w:tc>
+          <w:tcPr>
+            <w:tcW w:type="dxa" w:w="3009"/>
+          </w:tcPr>
+          <w:p>
+            <w:r/>
+            <w:r>
+              <w:rPr>
+                <w:sz w:val="19"/>
+              </w:rPr>
+              <w:t>ENABLED</w:t>
+            </w:r>
+          </w:p>
+        </w:tc>
+      </w:tr>
+    </w:tbl>
+    <w:p>
+      <w:pPr>
+        <w:pStyle w:val="a5"/>
+        <w:jc w:val="center"/>
+      </w:pPr>
+      <w:r>
+        <w:t>Table 3-</w:t>
+      </w:r>
+      <w:r>
+        <w:fldChar w:fldCharType="begin"/>
+      </w:r>
+      <w:r>
+        <w:instrText xml:space="preserve"> SEQ Table \* ARABIC </w:instrText>
+      </w:r>
+      <w:r>
+        <w:fldChar w:fldCharType="separate"/>
+      </w:r>
+      <w:r>
+        <w:t>7</w:t>
+      </w:r>
+      <w:r>
+        <w:fldChar w:fldCharType="end"/>
+      </w:r>
+      <w:r>
+        <w:t>. 논리적 복구 대상별 사후 정합성 검증 기준</w:t>
+      </w:r>
+    </w:p>
+    <w:p>
+      <w:pPr>
+        <w:pStyle w:val="3"/>
+      </w:pPr>
+      <w:r>
+        <w:t>③ 테스트 객체 정리</w:t>
+      </w:r>
+    </w:p>
+    <w:p>
+      <w:pPr>
+        <w:pStyle w:val="a0"/>
+      </w:pPr>
+      <w:r>
+        <w:t>FB_DROP_TEST PURGE</w:t>
+      </w:r>
+    </w:p>
+    <w:p>
+      <w:pPr>
+        <w:pStyle w:val="a0"/>
+      </w:pPr>
+      <w:r>
+        <w:t>임시 테스트 객체 삭제</w:t>
+      </w:r>
+    </w:p>
+    <w:p>
+      <w:pPr>
+        <w:pStyle w:val="a0"/>
+      </w:pPr>
+      <w:r>
+        <w:t>실습용 파일명 .lost 정리 여부 확인</w:t>
+      </w:r>
+    </w:p>
+    <w:p>
+      <w:pPr>
+        <w:pStyle w:val="a0"/>
+      </w:pPr>
+      <w:r>
+        <w:t>실제 업무 데이터 유지 확인</w:t>
+      </w:r>
+    </w:p>
+    <w:p>
+      <w:pPr>
+        <w:pStyle w:val="3"/>
+      </w:pPr>
+      <w:r>
+        <w:t>④ 아카이브 로그 백업 및 삭제</w:t>
+      </w:r>
+    </w:p>
+    <w:p>
+      <w:r>
+        <w:t>모든 복구와 검증이 완료된 이후 아카이브 로그를 백업하고 입력 로그를 삭제하여 디스크 공간을 확보하였다. 복구 가능 시점이 필요한 상태에서 먼저 삭제하지 않도록 주의하였다.</w:t>
+      </w:r>
+    </w:p>
+    <w:p>
+      <w:pPr>
+        <w:spacing w:after="80"/>
+        <w:ind w:left="288"/>
+        <w:shd w:val="clear" w:fill="F2F3F5"/>
+      </w:pPr>
+      <w:r>
+        <w:rPr>
+          <w:rFonts w:ascii="Consolas" w:hAnsi="Consolas" w:eastAsia="Consolas"/>
+          <w:sz w:val="19"/>
+        </w:rPr>
+        <w:t>RMAN&gt; BACKUP ARCHIVELOG ALL DELETE INPUT;</w:t>
+      </w:r>
+    </w:p>
+    <w:p>
+      <w:pPr>
+        <w:jc w:val="center"/>
+      </w:pPr>
+      <w:r>
+        <w:drawing>
+          <wp:inline xmlns:a="http://schemas.openxmlformats.org/drawingml/2006/main" xmlns:pic="http://schemas.openxmlformats.org/drawingml/2006/picture">
+            <wp:extent cx="5731510" cy="4296745"/>
+            <wp:docPr id="46" name="Picture 46"/>
+            <wp:cNvGraphicFramePr>
+              <a:graphicFrameLocks noChangeAspect="1"/>
+            </wp:cNvGraphicFramePr>
+            <a:graphic>
+              <a:graphicData uri="http://schemas.openxmlformats.org/drawingml/2006/picture">
+                <pic:pic>
+                  <pic:nvPicPr>
+                    <pic:cNvPr id="0" name="image.png"/>
+                    <pic:cNvPicPr/>
+                  </pic:nvPicPr>
+                  <pic:blipFill>
+                    <a:blip r:embed="rId66"/>
+                    <a:stretch>
+                      <a:fillRect/>
+                    </a:stretch>
+                  </pic:blipFill>
+                  <pic:spPr>
+                    <a:xfrm>
+                      <a:off x="0" y="0"/>
+                      <a:ext cx="5731510" cy="4296745"/>
+                    </a:xfrm>
+                    <a:prstGeom prst="rect"/>
+                  </pic:spPr>
+                </pic:pic>
+              </a:graphicData>
+            </a:graphic>
+          </wp:inline>
+        </w:drawing>
+      </w:r>
+    </w:p>
+    <w:p>
+      <w:pPr>
+        <w:pStyle w:val="a5"/>
+        <w:jc w:val="center"/>
+      </w:pPr>
+      <w:r>
+        <w:t>Figure 3-</w:t>
+      </w:r>
+      <w:r>
+        <w:fldChar w:fldCharType="begin"/>
+      </w:r>
+      <w:r>
+        <w:instrText xml:space="preserve"> SEQ Figure \* ARABIC </w:instrText>
+      </w:r>
+      <w:r>
+        <w:fldChar w:fldCharType="separate"/>
+      </w:r>
+      <w:r>
+        <w:t>26</w:t>
+      </w:r>
+      <w:r>
+        <w:fldChar w:fldCharType="end"/>
+      </w:r>
+      <w:r>
+        <w:t>. 복구 실습 종료 후 아카이브 로그 백업 및 정리</w:t>
+      </w:r>
+    </w:p>
+    <w:p>
+      <w:pPr>
+        <w:pStyle w:val="2"/>
+      </w:pPr>
+      <w:r>
+        <w:t>8) 종합 결과 및 결론</w:t>
+      </w:r>
+    </w:p>
+    <w:tbl>
+      <w:tblPr>
+        <w:tblStyle w:val="a4"/>
+        <w:tblW w:type="auto" w:w="0"/>
+        <w:tblLook w:firstColumn="1" w:firstRow="1" w:lastColumn="0" w:lastRow="0" w:noHBand="0" w:noVBand="1" w:val="04A0"/>
+      </w:tblPr>
+      <w:tblGrid>
+        <w:gridCol w:w="1504"/>
+        <w:gridCol w:w="1504"/>
+        <w:gridCol w:w="1504"/>
+        <w:gridCol w:w="1504"/>
+        <w:gridCol w:w="1504"/>
+        <w:gridCol w:w="1504"/>
+      </w:tblGrid>
+      <w:tr>
+        <w:tc>
+          <w:tcPr>
+            <w:tcW w:type="dxa" w:w="1504"/>
+          </w:tcPr>
+          <w:p>
+            <w:r/>
+            <w:r>
+              <w:rPr>
+                <w:b/>
+                <w:sz w:val="19"/>
+              </w:rPr>
+              <w:t>Case</w:t>
+            </w:r>
+          </w:p>
+        </w:tc>
+        <w:tc>
+          <w:tcPr>
+            <w:tcW w:type="dxa" w:w="1504"/>
+          </w:tcPr>
+          <w:p>
+            <w:r/>
+            <w:r>
+              <w:rPr>
+                <w:b/>
+                <w:sz w:val="19"/>
+              </w:rPr>
+              <w:t>장애 범위</w:t>
+            </w:r>
+          </w:p>
+        </w:tc>
+        <w:tc>
+          <w:tcPr>
+            <w:tcW w:type="dxa" w:w="1504"/>
+          </w:tcPr>
+          <w:p>
+            <w:r/>
+            <w:r>
+              <w:rPr>
+                <w:b/>
+                <w:sz w:val="19"/>
+              </w:rPr>
+              <w:t>복구 기술</w:t>
+            </w:r>
+          </w:p>
+        </w:tc>
+        <w:tc>
+          <w:tcPr>
+            <w:tcW w:type="dxa" w:w="1504"/>
+          </w:tcPr>
+          <w:p>
+            <w:r/>
+            <w:r>
+              <w:rPr>
+                <w:b/>
+                <w:sz w:val="19"/>
+              </w:rPr>
+              <w:t>DB 상태</w:t>
+            </w:r>
+          </w:p>
+        </w:tc>
+        <w:tc>
+          <w:tcPr>
+            <w:tcW w:type="dxa" w:w="1504"/>
+          </w:tcPr>
+          <w:p>
+            <w:r/>
+            <w:r>
+              <w:rPr>
+                <w:b/>
+                <w:sz w:val="19"/>
+              </w:rPr>
+              <w:t>서비스 영향</w:t>
+            </w:r>
+          </w:p>
+        </w:tc>
+        <w:tc>
+          <w:tcPr>
+            <w:tcW w:type="dxa" w:w="1504"/>
+          </w:tcPr>
+          <w:p>
+            <w:r/>
+            <w:r>
+              <w:rPr>
+                <w:b/>
+                <w:sz w:val="19"/>
+              </w:rPr>
+              <w:t>핵심 결과</w:t>
+            </w:r>
+          </w:p>
+        </w:tc>
+      </w:tr>
+      <w:tr>
+        <w:tc>
+          <w:tcPr>
+            <w:tcW w:type="dxa" w:w="1504"/>
+          </w:tcPr>
+          <w:p>
+            <w:r/>
+            <w:r>
+              <w:rPr>
+                <w:sz w:val="19"/>
+              </w:rPr>
+              <w:t>1</w:t>
+            </w:r>
+          </w:p>
+        </w:tc>
+        <w:tc>
+          <w:tcPr>
+            <w:tcW w:type="dxa" w:w="1504"/>
+          </w:tcPr>
+          <w:p>
+            <w:r/>
+            <w:r>
+              <w:rPr>
+                <w:sz w:val="19"/>
+              </w:rPr>
+              <w:t>ORDERS 데이터파일</w:t>
+            </w:r>
+          </w:p>
+        </w:tc>
+        <w:tc>
+          <w:tcPr>
+            <w:tcW w:type="dxa" w:w="1504"/>
+          </w:tcPr>
+          <w:p>
+            <w:r/>
+            <w:r>
+              <w:rPr>
+                <w:sz w:val="19"/>
+              </w:rPr>
+              <w:t>RMAN Datafile Recovery</w:t>
+            </w:r>
+          </w:p>
+        </w:tc>
+        <w:tc>
+          <w:tcPr>
+            <w:tcW w:type="dxa" w:w="1504"/>
+          </w:tcPr>
+          <w:p>
+            <w:r/>
+            <w:r>
+              <w:rPr>
+                <w:sz w:val="19"/>
+              </w:rPr>
+              <w:t>OPEN</w:t>
+            </w:r>
+          </w:p>
+        </w:tc>
+        <w:tc>
+          <w:tcPr>
+            <w:tcW w:type="dxa" w:w="1504"/>
+          </w:tcPr>
+          <w:p>
+            <w:r/>
+            <w:r>
+              <w:rPr>
+                <w:sz w:val="19"/>
+              </w:rPr>
+              <w:t>ORDERS만 일시 사용 불가</w:t>
+            </w:r>
+          </w:p>
+        </w:tc>
+        <w:tc>
+          <w:tcPr>
+            <w:tcW w:type="dxa" w:w="1504"/>
+          </w:tcPr>
+          <w:p>
+            <w:r/>
+            <w:r>
+              <w:rPr>
+                <w:sz w:val="19"/>
+              </w:rPr>
+              <w:t>파일 단위 격리 확인</w:t>
+            </w:r>
+          </w:p>
+        </w:tc>
+      </w:tr>
+      <w:tr>
+        <w:tc>
+          <w:tcPr>
+            <w:tcW w:type="dxa" w:w="1504"/>
+          </w:tcPr>
+          <w:p>
+            <w:r/>
+            <w:r>
+              <w:rPr>
+                <w:sz w:val="19"/>
+              </w:rPr>
+              <w:t>2</w:t>
+            </w:r>
+          </w:p>
+        </w:tc>
+        <w:tc>
+          <w:tcPr>
+            <w:tcW w:type="dxa" w:w="1504"/>
+          </w:tcPr>
+          <w:p>
+            <w:r/>
+            <w:r>
+              <w:rPr>
+                <w:sz w:val="19"/>
+              </w:rPr>
+              <w:t>SYSTEM 데이터파일</w:t>
+            </w:r>
+          </w:p>
+        </w:tc>
+        <w:tc>
+          <w:tcPr>
+            <w:tcW w:type="dxa" w:w="1504"/>
+          </w:tcPr>
+          <w:p>
+            <w:r/>
+            <w:r>
+              <w:rPr>
+                <w:sz w:val="19"/>
+              </w:rPr>
+              <w:t>Closed Recovery</w:t>
+            </w:r>
+          </w:p>
+        </w:tc>
+        <w:tc>
+          <w:tcPr>
+            <w:tcW w:type="dxa" w:w="1504"/>
+          </w:tcPr>
+          <w:p>
+            <w:r/>
+            <w:r>
+              <w:rPr>
+                <w:sz w:val="19"/>
+              </w:rPr>
+              <w:t>MOUNT</w:t>
+            </w:r>
+          </w:p>
+        </w:tc>
+        <w:tc>
+          <w:tcPr>
+            <w:tcW w:type="dxa" w:w="1504"/>
+          </w:tcPr>
+          <w:p>
+            <w:r/>
+            <w:r>
+              <w:rPr>
+                <w:sz w:val="19"/>
+              </w:rPr>
+              <w:t>전체 중단</w:t>
+            </w:r>
+          </w:p>
+        </w:tc>
+        <w:tc>
+          <w:tcPr>
+            <w:tcW w:type="dxa" w:w="1504"/>
+          </w:tcPr>
+          <w:p>
+            <w:r/>
+            <w:r>
+              <w:rPr>
+                <w:sz w:val="19"/>
+              </w:rPr>
+              <w:t>필수 파일 복구 확인</w:t>
+            </w:r>
+          </w:p>
+        </w:tc>
+      </w:tr>
+      <w:tr>
+        <w:tc>
+          <w:tcPr>
+            <w:tcW w:type="dxa" w:w="1504"/>
+          </w:tcPr>
+          <w:p>
+            <w:r/>
+            <w:r>
+              <w:rPr>
+                <w:sz w:val="19"/>
+              </w:rPr>
+              <w:t>3</w:t>
+            </w:r>
+          </w:p>
+        </w:tc>
+        <w:tc>
+          <w:tcPr>
+            <w:tcW w:type="dxa" w:w="1504"/>
+          </w:tcPr>
+          <w:p>
+            <w:r/>
+            <w:r>
+              <w:rPr>
+                <w:sz w:val="19"/>
+              </w:rPr>
+              <w:t>INQUIRIES 특정 블록</w:t>
+            </w:r>
+          </w:p>
+        </w:tc>
+        <w:tc>
+          <w:tcPr>
+            <w:tcW w:type="dxa" w:w="1504"/>
+          </w:tcPr>
+          <w:p>
+            <w:r/>
+            <w:r>
+              <w:rPr>
+                <w:sz w:val="19"/>
+              </w:rPr>
+              <w:t>Block Media Recovery</w:t>
+            </w:r>
+          </w:p>
+        </w:tc>
+        <w:tc>
+          <w:tcPr>
+            <w:tcW w:type="dxa" w:w="1504"/>
+          </w:tcPr>
+          <w:p>
+            <w:r/>
+            <w:r>
+              <w:rPr>
+                <w:sz w:val="19"/>
+              </w:rPr>
+              <w:t>OPEN</w:t>
+            </w:r>
+          </w:p>
+        </w:tc>
+        <w:tc>
+          <w:tcPr>
+            <w:tcW w:type="dxa" w:w="1504"/>
+          </w:tcPr>
+          <w:p>
+            <w:r/>
+            <w:r>
+              <w:rPr>
+                <w:sz w:val="19"/>
+              </w:rPr>
+              <w:t>손상 블록 접근 실패</w:t>
+            </w:r>
+          </w:p>
+        </w:tc>
+        <w:tc>
+          <w:tcPr>
+            <w:tcW w:type="dxa" w:w="1504"/>
+          </w:tcPr>
+          <w:p>
+            <w:r/>
+            <w:r>
+              <w:rPr>
+                <w:sz w:val="19"/>
+              </w:rPr>
+              <w:t>최소 범위 복구 확인</w:t>
+            </w:r>
+          </w:p>
+        </w:tc>
+      </w:tr>
+      <w:tr>
+        <w:tc>
+          <w:tcPr>
+            <w:tcW w:type="dxa" w:w="1504"/>
+          </w:tcPr>
+          <w:p>
+            <w:r/>
+            <w:r>
+              <w:rPr>
+                <w:sz w:val="19"/>
+              </w:rPr>
+              <w:t>4A</w:t>
+            </w:r>
+          </w:p>
+        </w:tc>
+        <w:tc>
+          <w:tcPr>
+            <w:tcW w:type="dxa" w:w="1504"/>
+          </w:tcPr>
+          <w:p>
+            <w:r/>
+            <w:r>
+              <w:rPr>
+                <w:sz w:val="19"/>
+              </w:rPr>
+              <w:t>행 전체 DELETE</w:t>
+            </w:r>
+          </w:p>
+        </w:tc>
+        <w:tc>
+          <w:tcPr>
+            <w:tcW w:type="dxa" w:w="1504"/>
+          </w:tcPr>
+          <w:p>
+            <w:r/>
+            <w:r>
+              <w:rPr>
+                <w:sz w:val="19"/>
+              </w:rPr>
+              <w:t>Flashback Table</w:t>
+            </w:r>
+          </w:p>
+        </w:tc>
+        <w:tc>
+          <w:tcPr>
+            <w:tcW w:type="dxa" w:w="1504"/>
+          </w:tcPr>
+          <w:p>
+            <w:r/>
+            <w:r>
+              <w:rPr>
+                <w:sz w:val="19"/>
+              </w:rPr>
+              <w:t>OPEN</w:t>
+            </w:r>
+          </w:p>
+        </w:tc>
+        <w:tc>
+          <w:tcPr>
+            <w:tcW w:type="dxa" w:w="1504"/>
+          </w:tcPr>
+          <w:p>
+            <w:r/>
+            <w:r>
+              <w:rPr>
+                <w:sz w:val="19"/>
+              </w:rPr>
+              <w:t>대상 데이터 논리 손상</w:t>
+            </w:r>
+          </w:p>
+        </w:tc>
+        <w:tc>
+          <w:tcPr>
+            <w:tcW w:type="dxa" w:w="1504"/>
+          </w:tcPr>
+          <w:p>
+            <w:r/>
+            <w:r>
+              <w:rPr>
+                <w:sz w:val="19"/>
+              </w:rPr>
+              <w:t>SCN 기반 복구</w:t>
+            </w:r>
+          </w:p>
+        </w:tc>
+      </w:tr>
+      <w:tr>
+        <w:tc>
+          <w:tcPr>
+            <w:tcW w:type="dxa" w:w="1504"/>
+          </w:tcPr>
+          <w:p>
+            <w:r/>
+            <w:r>
+              <w:rPr>
+                <w:sz w:val="19"/>
+              </w:rPr>
+              <w:t>4B</w:t>
+            </w:r>
+          </w:p>
+        </w:tc>
+        <w:tc>
+          <w:tcPr>
+            <w:tcW w:type="dxa" w:w="1504"/>
+          </w:tcPr>
+          <w:p>
+            <w:r/>
+            <w:r>
+              <w:rPr>
+                <w:sz w:val="19"/>
+              </w:rPr>
+              <w:t>테이블 DROP</w:t>
+            </w:r>
+          </w:p>
+        </w:tc>
+        <w:tc>
+          <w:tcPr>
+            <w:tcW w:type="dxa" w:w="1504"/>
+          </w:tcPr>
+          <w:p>
+            <w:r/>
+            <w:r>
+              <w:rPr>
+                <w:sz w:val="19"/>
+              </w:rPr>
+              <w:t>Flashback Drop</w:t>
+            </w:r>
+          </w:p>
+        </w:tc>
+        <w:tc>
+          <w:tcPr>
+            <w:tcW w:type="dxa" w:w="1504"/>
+          </w:tcPr>
+          <w:p>
+            <w:r/>
+            <w:r>
+              <w:rPr>
+                <w:sz w:val="19"/>
+              </w:rPr>
+              <w:t>OPEN</w:t>
+            </w:r>
+          </w:p>
+        </w:tc>
+        <w:tc>
+          <w:tcPr>
+            <w:tcW w:type="dxa" w:w="1504"/>
+          </w:tcPr>
+          <w:p>
+            <w:r/>
+            <w:r>
+              <w:rPr>
+                <w:sz w:val="19"/>
+              </w:rPr>
+              <w:t>대상 객체 부재</w:t>
+            </w:r>
+          </w:p>
+        </w:tc>
+        <w:tc>
+          <w:tcPr>
+            <w:tcW w:type="dxa" w:w="1504"/>
+          </w:tcPr>
+          <w:p>
+            <w:r/>
+            <w:r>
+              <w:rPr>
+                <w:sz w:val="19"/>
+              </w:rPr>
+              <w:t>Recycle Bin 복구</w:t>
+            </w:r>
+          </w:p>
+        </w:tc>
+      </w:tr>
+      <w:tr>
+        <w:tc>
+          <w:tcPr>
+            <w:tcW w:type="dxa" w:w="1504"/>
+          </w:tcPr>
+          <w:p>
+            <w:r/>
+            <w:r>
+              <w:rPr>
+                <w:sz w:val="19"/>
+              </w:rPr>
+              <w:t>5</w:t>
+            </w:r>
+          </w:p>
+        </w:tc>
+        <w:tc>
+          <w:tcPr>
+            <w:tcW w:type="dxa" w:w="1504"/>
+          </w:tcPr>
+          <w:p>
+            <w:r/>
+            <w:r>
+              <w:rPr>
+                <w:sz w:val="19"/>
+              </w:rPr>
+              <w:t>객체 유실·Recycle Bin 부재</w:t>
+            </w:r>
+          </w:p>
+        </w:tc>
+        <w:tc>
+          <w:tcPr>
+            <w:tcW w:type="dxa" w:w="1504"/>
+          </w:tcPr>
+          <w:p>
+            <w:r/>
+            <w:r>
+              <w:rPr>
+                <w:sz w:val="19"/>
+              </w:rPr>
+              <w:t>Original Import</w:t>
+            </w:r>
+          </w:p>
+        </w:tc>
+        <w:tc>
+          <w:tcPr>
+            <w:tcW w:type="dxa" w:w="1504"/>
+          </w:tcPr>
+          <w:p>
+            <w:r/>
+            <w:r>
+              <w:rPr>
+                <w:sz w:val="19"/>
+              </w:rPr>
+              <w:t>OPEN</w:t>
+            </w:r>
+          </w:p>
+        </w:tc>
+        <w:tc>
+          <w:tcPr>
+            <w:tcW w:type="dxa" w:w="1504"/>
+          </w:tcPr>
+          <w:p>
+            <w:r/>
+            <w:r>
+              <w:rPr>
+                <w:sz w:val="19"/>
+              </w:rPr>
+              <w:t>대상 객체 부재</w:t>
+            </w:r>
+          </w:p>
+        </w:tc>
+        <w:tc>
+          <w:tcPr>
+            <w:tcW w:type="dxa" w:w="1504"/>
+          </w:tcPr>
+          <w:p>
+            <w:r/>
+            <w:r>
+              <w:rPr>
+                <w:sz w:val="19"/>
+              </w:rPr>
+              <w:t>덤프 기반 복원</w:t>
+            </w:r>
+          </w:p>
+        </w:tc>
+      </w:tr>
+    </w:tbl>
+    <w:p>
+      <w:pPr>
+        <w:pStyle w:val="a5"/>
+        <w:jc w:val="center"/>
+      </w:pPr>
+      <w:r>
+        <w:t>Table 3-</w:t>
+      </w:r>
+      <w:r>
+        <w:fldChar w:fldCharType="begin"/>
+      </w:r>
+      <w:r>
+        <w:instrText xml:space="preserve"> SEQ Table \* ARABIC </w:instrText>
+      </w:r>
+      <w:r>
+        <w:fldChar w:fldCharType="separate"/>
+      </w:r>
+      <w:r>
+        <w:t>8</w:t>
+      </w:r>
+      <w:r>
+        <w:fldChar w:fldCharType="end"/>
+      </w:r>
+      <w:r>
+        <w:t>. 장애 시나리오별 복구 방식과 최종 검증 결과</w:t>
+      </w:r>
+    </w:p>
+    <w:p>
+      <w:r>
+        <w:t>본 Part에서는 데이터파일·SYSTEM 파일·데이터 블록의 물리적 손상과 DELETE·DROP·객체 유실의 논리적 장애를 재현하고, 손상 범위에 맞는 복구 절차를 검증하였다.</w:t>
+      </w:r>
+    </w:p>
+    <w:p>
+      <w:r>
+        <w:t>Case 1과 Case 3은 데이터베이스를 OPEN 상태로 유지한 채 각각 데이터파일과 블록을 복구할 수 있었으며, 정상 테이블스페이스의 서비스는 지속되었다. 다만 복구 대상 객체 또는 손상 블록은 복구 완료 전까지 사용할 수 없었다. Case 2는 SYSTEM 데이터파일이 데이터베이스 운영에 필수적인 파일이므로 MOUNT 상태에서 Closed Recovery를 수행해야 했다.</w:t>
+      </w:r>
+    </w:p>
+    <w:p>
+      <w:r>
+        <w:t>논리적 장애에서는 Flashback Table과 Flashback Drop을 통해 백업 복원 없이 대상 데이터와 객체를 복구하였다. 그러나 Flashback Table은 UNDO 보존 범위, Flashback Drop은 Recycle Bin 보존 여부라는 제약이 있었다. Recycle Bin에 객체가 남아 있지 않은 경우에는 사전 Export 덤프와 올바른 Import 도구가 복구 수단이 되었다.</w:t>
+      </w:r>
+    </w:p>
+    <w:p>
+      <w:r>
+        <w:t>실습에서 확인한 첫 번째 핵심은 격리 설계의 범위이다. 파일 단위 장애의 영향을 분리하려면 테이블스페이스만 나누는 것으로 충분하지 않으며, 테이블과 관련된 인덱스·LOB 세그먼트까지 동일한 복구 경계에 포함해야 한다.</w:t>
+      </w:r>
+    </w:p>
+    <w:p>
+      <w:r>
+        <w:t>두 번째 핵심은 장애 검출 방식이다. 열린 파일 핸들과 인덱스 전용 실행계획 때문에 데이터파일이 손상되어도 일부 SQL이 정상 실행될 수 있었다. 따라서 장애 여부는 단순 조회 결과뿐 아니라 실제 테이블 블록 접근, 실행계획, 데이터파일·테이블스페이스 상태 및 손상 뷰를 함께 확인해야 한다.</w:t>
+      </w:r>
+    </w:p>
+    <w:p>
+      <w:r>
+        <w:t>세 번째 핵심은 복구 범위의 경계이다. RMAN, Flashback Table, Flashback Drop 및 Import는 각각 복구할 수 있는 범위가 다르다. 복구 완료 후에는 데이터 건수뿐 아니라 인덱스, PK·FK, 권한 및 종속 객체까지 별도로 검증해야 완전한 복구로 판단할 수 있다.</w:t>
+      </w:r>
+    </w:p>
+    <w:p>
+      <w:r>
+        <w:t>결론적으로 백업·복구 전략은 장애 발생 후 명령을 실행하는 절차에 그치지 않는다. 사고 이전의 물리적 격리 설계, 백업 확보, 장애 범위 식별, 최소 단위 복구, 종속 객체 검증까지 포함한 전체 운영 체계로 설계해야 한다.</w:t>
+      </w:r>
+    </w:p>
+    <w:p>
+      <w:pPr>
+        <w:pStyle w:val="2"/>
+      </w:pPr>
+      <w:r>
+        <w:t>Appendix. 초기 실행 화면 보존</w:t>
+      </w:r>
+    </w:p>
+    <w:p>
+      <w:pPr>
+        <w:pStyle w:val="3"/>
+      </w:pPr>
+      <w:r>
+        <w:t>A-3. TIMESTAMP 기준 Flashback Table 초기 실험</w:t>
+      </w:r>
+    </w:p>
+    <w:p>
+      <w:r>
+        <w:t>Case 4A를 최초에는 TIMESTAMP 방식(SYSTIMESTAMP - INTERVAL '5' MINUTE)으로 수행하여 CUST_CONTACTS를 복구하였다(219,995건 복구 확인). 본문은 재현성이 높은 SCN 기준으로 재구성하였으며, 초기 실험 화면은 아래에 보존한다.</w:t>
       </w:r>
     </w:p>
     <w:p>
@@ -4468,7 +7057,7 @@
         <w:drawing>
           <wp:inline xmlns:a="http://schemas.openxmlformats.org/drawingml/2006/main" xmlns:pic="http://schemas.openxmlformats.org/drawingml/2006/picture">
             <wp:extent cx="4704789" cy="2234775"/>
-            <wp:docPr id="42" name="Picture 42"/>
+            <wp:docPr id="47" name="Picture 47"/>
             <wp:cNvGraphicFramePr>
               <a:graphicFrameLocks noChangeAspect="1"/>
             </wp:cNvGraphicFramePr>
@@ -4507,7 +7096,7 @@
         <w:drawing>
           <wp:inline xmlns:a="http://schemas.openxmlformats.org/drawingml/2006/main" xmlns:pic="http://schemas.openxmlformats.org/drawingml/2006/picture">
             <wp:extent cx="3942678" cy="1998344"/>
-            <wp:docPr id="43" name="Picture 43"/>
+            <wp:docPr id="48" name="Picture 48"/>
             <wp:cNvGraphicFramePr>
               <a:graphicFrameLocks noChangeAspect="1"/>
             </wp:cNvGraphicFramePr>
@@ -4536,1631 +7125,6 @@
             </a:graphic>
           </wp:inline>
         </w:drawing>
-      </w:r>
-    </w:p>
-    <w:p>
-      <w:pPr>
-        <w:pStyle w:val="a5"/>
-        <w:jc w:val="center"/>
-      </w:pPr>
-      <w:r>
-        <w:t>Figure 3-19. Case 4A CUST_CONTACTS 전체 삭제 및 0건 확인</w:t>
-      </w:r>
-    </w:p>
-    <w:p>
-      <w:r>
-        <w:t>복구는 사고 직전에 저장한 SCN을 기준으로 수행한다. UNDO_RETENTION 시간 안에 수행해야 한다.</w:t>
-      </w:r>
-    </w:p>
-    <w:p>
-      <w:pPr>
-        <w:spacing w:after="80"/>
-        <w:ind w:left="288"/>
-        <w:shd w:val="clear" w:fill="F2F3F5"/>
-      </w:pPr>
-      <w:r>
-        <w:rPr>
-          <w:rFonts w:ascii="Consolas" w:hAnsi="Consolas" w:eastAsia="Consolas"/>
-          <w:sz w:val="19"/>
-        </w:rPr>
-        <w:t>FLASHBACK TABLE BO.CUST_CONTACTS TO SCN &lt;사고 직전 SCN&gt;;</w:t>
-      </w:r>
-      <w:r>
-        <w:br/>
-      </w:r>
-      <w:r>
-        <w:rPr>
-          <w:rFonts w:ascii="Consolas" w:hAnsi="Consolas" w:eastAsia="Consolas"/>
-          <w:sz w:val="19"/>
-        </w:rPr>
-        <w:t>SELECT COUNT(*) FROM BO.CUST_CONTACTS;</w:t>
-      </w:r>
-    </w:p>
-    <w:p>
-      <w:pPr>
-        <w:jc w:val="center"/>
-        <w:shd w:val="clear" w:fill="FBEAE7"/>
-      </w:pPr>
-      <w:r>
-        <w:rPr>
-          <w:i/>
-          <w:color w:val="B03A2E"/>
-          <w:sz w:val="20"/>
-        </w:rPr>
-        <w:t>［ Figure 3-20. Case 4A Flashback Table(SCN 방식) 수행 및 복구 확인 — SCN 방식 재실행 후 캡처 필요 ］</w:t>
-      </w:r>
-    </w:p>
-    <w:p>
-      <w:r>
-        <w:t>※ 현재 문서에 남아 있는 초기 실행 화면은 TIMESTAMP 방식(SYSTIMESTAMP - INTERVAL '5' MINUTE)으로 수행된 것으로, Appendix A-3에 별도 보존하였다. 위 SCN 기반 절차로 재실행한 뒤 새 화면으로 교체한다.</w:t>
-      </w:r>
-    </w:p>
-    <w:p>
-      <w:r>
-        <w:t>Flashback Table은 백업 복원 없이 특정 테이블을 사고 이전 SCN으로 되돌릴 수 있었으나, 충분한 UNDO 보존과 ROW MOVEMENT 설정이 필요하였다.</w:t>
-      </w:r>
-    </w:p>
-    <w:p>
-      <w:pPr>
-        <w:pStyle w:val="3"/>
-      </w:pPr>
-      <w:r>
-        <w:t>② Case 4B — FB_DROP_TEST DROP과 Flashback Drop</w:t>
-      </w:r>
-    </w:p>
-    <w:p>
-      <w:r>
-        <w:t>CATEGORIES는 PRODUCTS가 FK로 참조하는 부모 테이블이다. 일반 DROP은 ORA-02449로 거부되고, CASCADE CONSTRAINTS를 사용하면 자식 테이블의 FK까지 제거되어 복구 범위가 확대된다. 따라서 실제 업무 객체를 손상시키지 않고 Flashback Drop 메커니즘을 검증하기 위해 독립 테스트 테이블 FB_DROP_TEST를 사용하였다.</w:t>
-      </w:r>
-    </w:p>
-    <w:p>
-      <w:pPr>
-        <w:spacing w:after="80"/>
-        <w:ind w:left="288"/>
-        <w:shd w:val="clear" w:fill="F2F3F5"/>
-      </w:pPr>
-      <w:r>
-        <w:rPr>
-          <w:rFonts w:ascii="Consolas" w:hAnsi="Consolas" w:eastAsia="Consolas"/>
-          <w:sz w:val="19"/>
-        </w:rPr>
-        <w:t>CREATE TABLE BO.FB_DROP_TEST AS SELECT * FROM BO.CATEGORIES;</w:t>
-      </w:r>
-      <w:r>
-        <w:br/>
-      </w:r>
-      <w:r>
-        <w:rPr>
-          <w:rFonts w:ascii="Consolas" w:hAnsi="Consolas" w:eastAsia="Consolas"/>
-          <w:sz w:val="19"/>
-        </w:rPr>
-        <w:t>SELECT COUNT(*) FROM BO.FB_DROP_TEST;</w:t>
-      </w:r>
-      <w:r>
-        <w:br/>
-      </w:r>
-      <w:r>
-        <w:rPr>
-          <w:rFonts w:ascii="Consolas" w:hAnsi="Consolas" w:eastAsia="Consolas"/>
-          <w:sz w:val="19"/>
-        </w:rPr>
-        <w:t>DROP TABLE BO.FB_DROP_TEST;</w:t>
-      </w:r>
-      <w:r>
-        <w:br/>
-      </w:r>
-      <w:r>
-        <w:rPr>
-          <w:rFonts w:ascii="Consolas" w:hAnsi="Consolas" w:eastAsia="Consolas"/>
-          <w:sz w:val="19"/>
-        </w:rPr>
-        <w:t>SELECT OBJECT_NAME, ORIGINAL_NAME, DROPTIME FROM USER_RECYCLEBIN</w:t>
-      </w:r>
-      <w:r>
-        <w:br/>
-      </w:r>
-      <w:r>
-        <w:rPr>
-          <w:rFonts w:ascii="Consolas" w:hAnsi="Consolas" w:eastAsia="Consolas"/>
-          <w:sz w:val="19"/>
-        </w:rPr>
-        <w:t xml:space="preserve"> WHERE ORIGINAL_NAME='FB_DROP_TEST';</w:t>
-      </w:r>
-      <w:r>
-        <w:br/>
-      </w:r>
-      <w:r>
-        <w:rPr>
-          <w:rFonts w:ascii="Consolas" w:hAnsi="Consolas" w:eastAsia="Consolas"/>
-          <w:sz w:val="19"/>
-        </w:rPr>
-        <w:t>FLASHBACK TABLE BO.FB_DROP_TEST TO BEFORE DROP;</w:t>
-      </w:r>
-      <w:r>
-        <w:br/>
-      </w:r>
-      <w:r>
-        <w:rPr>
-          <w:rFonts w:ascii="Consolas" w:hAnsi="Consolas" w:eastAsia="Consolas"/>
-          <w:sz w:val="19"/>
-        </w:rPr>
-        <w:t>SELECT COUNT(*) FROM BO.FB_DROP_TEST;</w:t>
-      </w:r>
-      <w:r>
-        <w:br/>
-      </w:r>
-      <w:r>
-        <w:rPr>
-          <w:rFonts w:ascii="Consolas" w:hAnsi="Consolas" w:eastAsia="Consolas"/>
-          <w:sz w:val="19"/>
-        </w:rPr>
-        <w:t>DROP TABLE BO.FB_DROP_TEST PURGE;</w:t>
-      </w:r>
-    </w:p>
-    <w:p>
-      <w:pPr>
-        <w:jc w:val="center"/>
-        <w:shd w:val="clear" w:fill="FBEAE7"/>
-      </w:pPr>
-      <w:r>
-        <w:rPr>
-          <w:i/>
-          <w:color w:val="B03A2E"/>
-          <w:sz w:val="20"/>
-        </w:rPr>
-        <w:t>［ Figure 3-21. Case 4B FB_DROP_TEST DROP 및 Recycle Bin 확인 — FB_DROP_TEST 실행 후 캡처 필요 ］</w:t>
-      </w:r>
-    </w:p>
-    <w:p>
-      <w:pPr>
-        <w:jc w:val="center"/>
-        <w:shd w:val="clear" w:fill="FBEAE7"/>
-      </w:pPr>
-      <w:r>
-        <w:rPr>
-          <w:i/>
-          <w:color w:val="B03A2E"/>
-          <w:sz w:val="20"/>
-        </w:rPr>
-        <w:t>［ Figure 3-22. Case 4B Flashback Drop 수행 및 테이블 복구 확인 — FB_DROP_TEST 실행 후 캡처 필요 ］</w:t>
-      </w:r>
-    </w:p>
-    <w:p>
-      <w:r>
-        <w:t>Flashback Drop은 Recycle Bin에 남은 DROP 객체 자신과 관련 인덱스를 복구하지만, CASCADE CONSTRAINTS로 다른 테이블에서 제거된 FK까지 자동 복원하지 않는다. 따라서 업무 테이블 복구 후에는 참조 제약과 권한 등 종속 객체를 별도로 확인해야 한다.</w:t>
-      </w:r>
-    </w:p>
-    <w:p>
-      <w:r>
-        <w:t>※ 참고 — 초기 CATEGORIES 실험에서 확인된 부수적 FK 손상: 초기에는 실제 업무 테이블 CATEGORIES를 CASCADE CONSTRAINTS로 DROP한 뒤 Flashback Drop으로 복구하였고, 함께 제거된 외부 FK(PRODUCTS_R1)가 자동 복구되지 않아 DBA_CONSTRAINTS AS OF TIMESTAMP로 이전 정의를 확인하여 수동 재생성하였다. 해당 실행 화면은 Appendix A-4에 보존하였다.</w:t>
-      </w:r>
-    </w:p>
-    <w:p>
-      <w:pPr>
-        <w:pStyle w:val="3"/>
-      </w:pPr>
-      <w:r>
-        <w:t>③ Case 5 — Recycle Bin 부재 시 Original Export 덤프 복구</w:t>
-      </w:r>
-    </w:p>
-    <w:p>
-      <w:r>
-        <w:t>BO_TEST가 유실된 상황에서 DBA_RECYCLEBIN 조회 결과가 없어 Flashback Drop으로 복구할 수 없었다. impdp 실행 시 ORA-39143이 발생하여 덤프가 Data Pump 형식이 아니라 Original Export(exp) 형식임을 확인하고, imp 유틸리티로 복구하였다.</w:t>
-      </w:r>
-    </w:p>
-    <w:p>
-      <w:pPr>
-        <w:spacing w:after="80"/>
-        <w:ind w:left="288"/>
-        <w:shd w:val="clear" w:fill="F2F3F5"/>
-      </w:pPr>
-      <w:r>
-        <w:rPr>
-          <w:rFonts w:ascii="Consolas" w:hAnsi="Consolas" w:eastAsia="Consolas"/>
-          <w:sz w:val="19"/>
-        </w:rPr>
-        <w:t>$ impdp ...        -- ORA-39143 발생 → Data Pump 덤프 아님</w:t>
-      </w:r>
-      <w:r>
-        <w:br/>
-      </w:r>
-      <w:r>
-        <w:rPr>
-          <w:rFonts w:ascii="Consolas" w:hAnsi="Consolas" w:eastAsia="Consolas"/>
-          <w:sz w:val="19"/>
-        </w:rPr>
-        <w:t>$ imp bo/**** FILE=bo_test.dmp FROMUSER=bo TOUSER=bo TABLES=BO_TEST</w:t>
-      </w:r>
-      <w:r>
-        <w:br/>
-      </w:r>
-      <w:r>
-        <w:rPr>
-          <w:rFonts w:ascii="Consolas" w:hAnsi="Consolas" w:eastAsia="Consolas"/>
-          <w:sz w:val="19"/>
-        </w:rPr>
-        <w:t>SQL&gt; SELECT COUNT(*) FROM BO.BO_TEST;               -- 1,000,000건</w:t>
-      </w:r>
-      <w:r>
-        <w:br/>
-      </w:r>
-      <w:r>
-        <w:rPr>
-          <w:rFonts w:ascii="Consolas" w:hAnsi="Consolas" w:eastAsia="Consolas"/>
-          <w:sz w:val="19"/>
-        </w:rPr>
-        <w:t>SQL&gt; SELECT INDEX_NAME, STATUS FROM DBA_INDEXES</w:t>
-      </w:r>
-      <w:r>
-        <w:br/>
-      </w:r>
-      <w:r>
-        <w:rPr>
-          <w:rFonts w:ascii="Consolas" w:hAnsi="Consolas" w:eastAsia="Consolas"/>
-          <w:sz w:val="19"/>
-        </w:rPr>
-        <w:t xml:space="preserve">      WHERE TABLE_NAME='BO_TEST';                   -- N1·N2 VALID</w:t>
-      </w:r>
-    </w:p>
-    <w:p>
-      <w:pPr>
-        <w:jc w:val="center"/>
-        <w:shd w:val="clear" w:fill="FBEAE7"/>
-      </w:pPr>
-      <w:r>
-        <w:rPr>
-          <w:i/>
-          <w:color w:val="B03A2E"/>
-          <w:sz w:val="20"/>
-        </w:rPr>
-        <w:t>［ Figure 3-23. Case 5 impdp ORA-39143 및 Original Export 형식 확인 — 캡처 필요 ］</w:t>
-      </w:r>
-    </w:p>
-    <w:p>
-      <w:pPr>
-        <w:jc w:val="center"/>
-        <w:shd w:val="clear" w:fill="FBEAE7"/>
-      </w:pPr>
-      <w:r>
-        <w:rPr>
-          <w:i/>
-          <w:color w:val="B03A2E"/>
-          <w:sz w:val="20"/>
-        </w:rPr>
-        <w:t>［ Figure 3-24. Case 5 imp 유틸리티를 이용한 BO_TEST 복구 결과 — 캡처 필요 ］</w:t>
-      </w:r>
-    </w:p>
-    <w:p>
-      <w:pPr>
-        <w:jc w:val="center"/>
-        <w:shd w:val="clear" w:fill="FBEAE7"/>
-      </w:pPr>
-      <w:r>
-        <w:rPr>
-          <w:i/>
-          <w:color w:val="B03A2E"/>
-          <w:sz w:val="20"/>
-        </w:rPr>
-        <w:t>［ Figure 3-25. Case 5 복구 테이블 건수(1,000,000)와 인덱스 VALID 상태 확인 — 캡처 필요 ］</w:t>
-      </w:r>
-    </w:p>
-    <w:p>
-      <w:r>
-        <w:t>실행 중 IMP-00403 권한 관련 경고가 발생했으나, 대상 테이블과 인덱스의 데이터·상태 검증 결과 복구 대상 객체는 정상적으로 복원되었다. 다만 운영 환경에서는 경고 대상 권한을 별도로 점검해야 한다.</w:t>
-      </w:r>
-    </w:p>
-    <w:p>
-      <w:r>
-        <w:t>Recycle Bin과 Flashback으로 복구할 수 없는 경우 사전 Export 덤프가 최후의 복구 수단이 될 수 있었다. 또한 덤프 형식에 따라 impdp와 imp를 구분해야 하며, 복구 완료 후에는 데이터 건수와 인덱스 상태를 함께 확인해야 한다.</w:t>
-      </w:r>
-    </w:p>
-    <w:p>
-      <w:pPr>
-        <w:pStyle w:val="2"/>
-      </w:pPr>
-      <w:r>
-        <w:t>7) 종합 검증 및 환경 정리</w:t>
-      </w:r>
-    </w:p>
-    <w:p>
-      <w:pPr>
-        <w:pStyle w:val="3"/>
-      </w:pPr>
-      <w:r>
-        <w:t>① RMAN 물리적 무결성 검증</w:t>
-      </w:r>
-    </w:p>
-    <w:p>
-      <w:r>
-        <w:t>Case 1~3에서 복구한 데이터파일과 블록을 포함해 데이터베이스 전체의 물리적·논리적 블록 상태를 검증하였다.</w:t>
-      </w:r>
-    </w:p>
-    <w:p>
-      <w:pPr>
-        <w:spacing w:after="80"/>
-        <w:ind w:left="288"/>
-        <w:shd w:val="clear" w:fill="F2F3F5"/>
-      </w:pPr>
-      <w:r>
-        <w:rPr>
-          <w:rFonts w:ascii="Consolas" w:hAnsi="Consolas" w:eastAsia="Consolas"/>
-          <w:sz w:val="19"/>
-        </w:rPr>
-        <w:t>RMAN&gt; VALIDATE CHECK LOGICAL DATABASE;</w:t>
-      </w:r>
-      <w:r>
-        <w:br/>
-      </w:r>
-      <w:r>
-        <w:rPr>
-          <w:rFonts w:ascii="Consolas" w:hAnsi="Consolas" w:eastAsia="Consolas"/>
-          <w:sz w:val="19"/>
-        </w:rPr>
-        <w:t>SQL&gt; SELECT * FROM V$DATABASE_BLOCK_CORRUPTION;</w:t>
-      </w:r>
-    </w:p>
-    <w:p>
-      <w:pPr>
-        <w:jc w:val="center"/>
-      </w:pPr>
-      <w:r>
-        <w:drawing>
-          <wp:inline xmlns:a="http://schemas.openxmlformats.org/drawingml/2006/main" xmlns:pic="http://schemas.openxmlformats.org/drawingml/2006/picture">
-            <wp:extent cx="4803799" cy="1555702"/>
-            <wp:docPr id="44" name="Picture 44"/>
-            <wp:cNvGraphicFramePr>
-              <a:graphicFrameLocks noChangeAspect="1"/>
-            </wp:cNvGraphicFramePr>
-            <a:graphic>
-              <a:graphicData uri="http://schemas.openxmlformats.org/drawingml/2006/picture">
-                <pic:pic>
-                  <pic:nvPicPr>
-                    <pic:cNvPr id="0" name="image.png"/>
-                    <pic:cNvPicPr/>
-                  </pic:nvPicPr>
-                  <pic:blipFill>
-                    <a:blip r:embed="rId62"/>
-                    <a:stretch>
-                      <a:fillRect/>
-                    </a:stretch>
-                  </pic:blipFill>
-                  <pic:spPr>
-                    <a:xfrm>
-                      <a:off x="0" y="0"/>
-                      <a:ext cx="4803799" cy="1555702"/>
-                    </a:xfrm>
-                    <a:prstGeom prst="rect"/>
-                  </pic:spPr>
-                </pic:pic>
-              </a:graphicData>
-            </a:graphic>
-          </wp:inline>
-        </w:drawing>
-      </w:r>
-    </w:p>
-    <w:p>
-      <w:pPr>
-        <w:jc w:val="center"/>
-      </w:pPr>
-      <w:r>
-        <w:drawing>
-          <wp:inline xmlns:a="http://schemas.openxmlformats.org/drawingml/2006/main" xmlns:pic="http://schemas.openxmlformats.org/drawingml/2006/picture">
-            <wp:extent cx="4869766" cy="3511664"/>
-            <wp:docPr id="45" name="Picture 45"/>
-            <wp:cNvGraphicFramePr>
-              <a:graphicFrameLocks noChangeAspect="1"/>
-            </wp:cNvGraphicFramePr>
-            <a:graphic>
-              <a:graphicData uri="http://schemas.openxmlformats.org/drawingml/2006/picture">
-                <pic:pic>
-                  <pic:nvPicPr>
-                    <pic:cNvPr id="0" name="image.png"/>
-                    <pic:cNvPicPr/>
-                  </pic:nvPicPr>
-                  <pic:blipFill>
-                    <a:blip r:embed="rId63"/>
-                    <a:stretch>
-                      <a:fillRect/>
-                    </a:stretch>
-                  </pic:blipFill>
-                  <pic:spPr>
-                    <a:xfrm>
-                      <a:off x="0" y="0"/>
-                      <a:ext cx="4869766" cy="3511664"/>
-                    </a:xfrm>
-                    <a:prstGeom prst="rect"/>
-                  </pic:spPr>
-                </pic:pic>
-              </a:graphicData>
-            </a:graphic>
-          </wp:inline>
-        </w:drawing>
-      </w:r>
-    </w:p>
-    <w:p>
-      <w:pPr>
-        <w:jc w:val="center"/>
-      </w:pPr>
-      <w:r>
-        <w:drawing>
-          <wp:inline xmlns:a="http://schemas.openxmlformats.org/drawingml/2006/main" xmlns:pic="http://schemas.openxmlformats.org/drawingml/2006/picture">
-            <wp:extent cx="4835501" cy="4432543"/>
-            <wp:docPr id="46" name="Picture 46"/>
-            <wp:cNvGraphicFramePr>
-              <a:graphicFrameLocks noChangeAspect="1"/>
-            </wp:cNvGraphicFramePr>
-            <a:graphic>
-              <a:graphicData uri="http://schemas.openxmlformats.org/drawingml/2006/picture">
-                <pic:pic>
-                  <pic:nvPicPr>
-                    <pic:cNvPr id="0" name="image.png"/>
-                    <pic:cNvPicPr/>
-                  </pic:nvPicPr>
-                  <pic:blipFill>
-                    <a:blip r:embed="rId64"/>
-                    <a:stretch>
-                      <a:fillRect/>
-                    </a:stretch>
-                  </pic:blipFill>
-                  <pic:spPr>
-                    <a:xfrm>
-                      <a:off x="0" y="0"/>
-                      <a:ext cx="4835501" cy="4432543"/>
-                    </a:xfrm>
-                    <a:prstGeom prst="rect"/>
-                  </pic:spPr>
-                </pic:pic>
-              </a:graphicData>
-            </a:graphic>
-          </wp:inline>
-        </w:drawing>
-      </w:r>
-    </w:p>
-    <w:p>
-      <w:pPr>
-        <w:jc w:val="center"/>
-      </w:pPr>
-      <w:r>
-        <w:drawing>
-          <wp:inline xmlns:a="http://schemas.openxmlformats.org/drawingml/2006/main" xmlns:pic="http://schemas.openxmlformats.org/drawingml/2006/picture">
-            <wp:extent cx="4813495" cy="1201767"/>
-            <wp:docPr id="47" name="Picture 47"/>
-            <wp:cNvGraphicFramePr>
-              <a:graphicFrameLocks noChangeAspect="1"/>
-            </wp:cNvGraphicFramePr>
-            <a:graphic>
-              <a:graphicData uri="http://schemas.openxmlformats.org/drawingml/2006/picture">
-                <pic:pic>
-                  <pic:nvPicPr>
-                    <pic:cNvPr id="0" name="image.png"/>
-                    <pic:cNvPicPr/>
-                  </pic:nvPicPr>
-                  <pic:blipFill>
-                    <a:blip r:embed="rId65"/>
-                    <a:stretch>
-                      <a:fillRect/>
-                    </a:stretch>
-                  </pic:blipFill>
-                  <pic:spPr>
-                    <a:xfrm>
-                      <a:off x="0" y="0"/>
-                      <a:ext cx="4813495" cy="1201767"/>
-                    </a:xfrm>
-                    <a:prstGeom prst="rect"/>
-                  </pic:spPr>
-                </pic:pic>
-              </a:graphicData>
-            </a:graphic>
-          </wp:inline>
-        </w:drawing>
-      </w:r>
-    </w:p>
-    <w:p>
-      <w:pPr>
-        <w:pStyle w:val="a5"/>
-        <w:jc w:val="center"/>
-      </w:pPr>
-      <w:r>
-        <w:t>Figure 3-26. 모든 물리적 복구 완료 후 RMAN VALIDATE 및 손상 블록 0건 확인</w:t>
-      </w:r>
-    </w:p>
-    <w:p>
-      <w:pPr>
-        <w:pStyle w:val="3"/>
-      </w:pPr>
-      <w:r>
-        <w:t>② 논리적 복구 결과 검증</w:t>
-      </w:r>
-    </w:p>
-    <w:tbl>
-      <w:tblPr>
-        <w:tblStyle w:val="a4"/>
-        <w:tblW w:type="auto" w:w="0"/>
-        <w:tblLook w:firstColumn="1" w:firstRow="1" w:lastColumn="0" w:lastRow="0" w:noHBand="0" w:noVBand="1" w:val="04A0"/>
-      </w:tblPr>
-      <w:tblGrid>
-        <w:gridCol w:w="3009"/>
-        <w:gridCol w:w="3009"/>
-        <w:gridCol w:w="3009"/>
-      </w:tblGrid>
-      <w:tr>
-        <w:tc>
-          <w:tcPr>
-            <w:tcW w:type="dxa" w:w="3009"/>
-          </w:tcPr>
-          <w:p>
-            <w:r/>
-            <w:r>
-              <w:rPr>
-                <w:b/>
-                <w:sz w:val="19"/>
-              </w:rPr>
-              <w:t>검증 대상</w:t>
-            </w:r>
-          </w:p>
-        </w:tc>
-        <w:tc>
-          <w:tcPr>
-            <w:tcW w:type="dxa" w:w="3009"/>
-          </w:tcPr>
-          <w:p>
-            <w:r/>
-            <w:r>
-              <w:rPr>
-                <w:b/>
-                <w:sz w:val="19"/>
-              </w:rPr>
-              <w:t>확인 항목</w:t>
-            </w:r>
-          </w:p>
-        </w:tc>
-        <w:tc>
-          <w:tcPr>
-            <w:tcW w:type="dxa" w:w="3009"/>
-          </w:tcPr>
-          <w:p>
-            <w:r/>
-            <w:r>
-              <w:rPr>
-                <w:b/>
-                <w:sz w:val="19"/>
-              </w:rPr>
-              <w:t>정상 기준</w:t>
-            </w:r>
-          </w:p>
-        </w:tc>
-      </w:tr>
-      <w:tr>
-        <w:tc>
-          <w:tcPr>
-            <w:tcW w:type="dxa" w:w="3009"/>
-          </w:tcPr>
-          <w:p>
-            <w:r/>
-            <w:r>
-              <w:rPr>
-                <w:sz w:val="19"/>
-              </w:rPr>
-              <w:t>CUST_CONTACTS</w:t>
-            </w:r>
-          </w:p>
-        </w:tc>
-        <w:tc>
-          <w:tcPr>
-            <w:tcW w:type="dxa" w:w="3009"/>
-          </w:tcPr>
-          <w:p>
-            <w:r/>
-            <w:r>
-              <w:rPr>
-                <w:sz w:val="19"/>
-              </w:rPr>
-              <w:t>사고 전 건수 복구</w:t>
-            </w:r>
-          </w:p>
-        </w:tc>
-        <w:tc>
-          <w:tcPr>
-            <w:tcW w:type="dxa" w:w="3009"/>
-          </w:tcPr>
-          <w:p>
-            <w:r/>
-            <w:r>
-              <w:rPr>
-                <w:sz w:val="19"/>
-              </w:rPr>
-              <w:t>원래 건수와 동일</w:t>
-            </w:r>
-          </w:p>
-        </w:tc>
-      </w:tr>
-      <w:tr>
-        <w:tc>
-          <w:tcPr>
-            <w:tcW w:type="dxa" w:w="3009"/>
-          </w:tcPr>
-          <w:p>
-            <w:r/>
-            <w:r>
-              <w:rPr>
-                <w:sz w:val="19"/>
-              </w:rPr>
-              <w:t>FB_DROP_TEST</w:t>
-            </w:r>
-          </w:p>
-        </w:tc>
-        <w:tc>
-          <w:tcPr>
-            <w:tcW w:type="dxa" w:w="3009"/>
-          </w:tcPr>
-          <w:p>
-            <w:r/>
-            <w:r>
-              <w:rPr>
-                <w:sz w:val="19"/>
-              </w:rPr>
-              <w:t>복구 후 데이터 건수</w:t>
-            </w:r>
-          </w:p>
-        </w:tc>
-        <w:tc>
-          <w:tcPr>
-            <w:tcW w:type="dxa" w:w="3009"/>
-          </w:tcPr>
-          <w:p>
-            <w:r/>
-            <w:r>
-              <w:rPr>
-                <w:sz w:val="19"/>
-              </w:rPr>
-              <w:t>생성 직후 건수와 동일</w:t>
-            </w:r>
-          </w:p>
-        </w:tc>
-      </w:tr>
-      <w:tr>
-        <w:tc>
-          <w:tcPr>
-            <w:tcW w:type="dxa" w:w="3009"/>
-          </w:tcPr>
-          <w:p>
-            <w:r/>
-            <w:r>
-              <w:rPr>
-                <w:sz w:val="19"/>
-              </w:rPr>
-              <w:t>BO_TEST</w:t>
-            </w:r>
-          </w:p>
-        </w:tc>
-        <w:tc>
-          <w:tcPr>
-            <w:tcW w:type="dxa" w:w="3009"/>
-          </w:tcPr>
-          <w:p>
-            <w:r/>
-            <w:r>
-              <w:rPr>
-                <w:sz w:val="19"/>
-              </w:rPr>
-              <w:t>복구 건수</w:t>
-            </w:r>
-          </w:p>
-        </w:tc>
-        <w:tc>
-          <w:tcPr>
-            <w:tcW w:type="dxa" w:w="3009"/>
-          </w:tcPr>
-          <w:p>
-            <w:r/>
-            <w:r>
-              <w:rPr>
-                <w:sz w:val="19"/>
-              </w:rPr>
-              <w:t>1,000,000건</w:t>
-            </w:r>
-          </w:p>
-        </w:tc>
-      </w:tr>
-      <w:tr>
-        <w:tc>
-          <w:tcPr>
-            <w:tcW w:type="dxa" w:w="3009"/>
-          </w:tcPr>
-          <w:p>
-            <w:r/>
-            <w:r>
-              <w:rPr>
-                <w:sz w:val="19"/>
-              </w:rPr>
-              <w:t>BO_TEST 인덱스</w:t>
-            </w:r>
-          </w:p>
-        </w:tc>
-        <w:tc>
-          <w:tcPr>
-            <w:tcW w:type="dxa" w:w="3009"/>
-          </w:tcPr>
-          <w:p>
-            <w:r/>
-            <w:r>
-              <w:rPr>
-                <w:sz w:val="19"/>
-              </w:rPr>
-              <w:t>STATUS</w:t>
-            </w:r>
-          </w:p>
-        </w:tc>
-        <w:tc>
-          <w:tcPr>
-            <w:tcW w:type="dxa" w:w="3009"/>
-          </w:tcPr>
-          <w:p>
-            <w:r/>
-            <w:r>
-              <w:rPr>
-                <w:sz w:val="19"/>
-              </w:rPr>
-              <w:t>VALID</w:t>
-            </w:r>
-          </w:p>
-        </w:tc>
-      </w:tr>
-      <w:tr>
-        <w:tc>
-          <w:tcPr>
-            <w:tcW w:type="dxa" w:w="3009"/>
-          </w:tcPr>
-          <w:p>
-            <w:r/>
-            <w:r>
-              <w:rPr>
-                <w:sz w:val="19"/>
-              </w:rPr>
-              <w:t>관련 PK·FK</w:t>
-            </w:r>
-          </w:p>
-        </w:tc>
-        <w:tc>
-          <w:tcPr>
-            <w:tcW w:type="dxa" w:w="3009"/>
-          </w:tcPr>
-          <w:p>
-            <w:r/>
-            <w:r>
-              <w:rPr>
-                <w:sz w:val="19"/>
-              </w:rPr>
-              <w:t>존재·상태</w:t>
-            </w:r>
-          </w:p>
-        </w:tc>
-        <w:tc>
-          <w:tcPr>
-            <w:tcW w:type="dxa" w:w="3009"/>
-          </w:tcPr>
-          <w:p>
-            <w:r/>
-            <w:r>
-              <w:rPr>
-                <w:sz w:val="19"/>
-              </w:rPr>
-              <w:t>ENABLED</w:t>
-            </w:r>
-          </w:p>
-        </w:tc>
-      </w:tr>
-    </w:tbl>
-    <w:p>
-      <w:pPr>
-        <w:pStyle w:val="a5"/>
-        <w:jc w:val="center"/>
-      </w:pPr>
-      <w:r>
-        <w:t>Table 3-7. 논리적 복구 대상별 사후 정합성 검증 기준</w:t>
-      </w:r>
-    </w:p>
-    <w:p>
-      <w:pPr>
-        <w:pStyle w:val="3"/>
-      </w:pPr>
-      <w:r>
-        <w:t>③ 테스트 객체 정리</w:t>
-      </w:r>
-    </w:p>
-    <w:p>
-      <w:pPr>
-        <w:pStyle w:val="a0"/>
-      </w:pPr>
-      <w:r>
-        <w:t>FB_DROP_TEST PURGE</w:t>
-      </w:r>
-    </w:p>
-    <w:p>
-      <w:pPr>
-        <w:pStyle w:val="a0"/>
-      </w:pPr>
-      <w:r>
-        <w:t>임시 테스트 객체 삭제</w:t>
-      </w:r>
-    </w:p>
-    <w:p>
-      <w:pPr>
-        <w:pStyle w:val="a0"/>
-      </w:pPr>
-      <w:r>
-        <w:t>실습용 파일명 .lost 정리 여부 확인</w:t>
-      </w:r>
-    </w:p>
-    <w:p>
-      <w:pPr>
-        <w:pStyle w:val="a0"/>
-      </w:pPr>
-      <w:r>
-        <w:t>실제 업무 데이터 유지 확인</w:t>
-      </w:r>
-    </w:p>
-    <w:p>
-      <w:pPr>
-        <w:pStyle w:val="3"/>
-      </w:pPr>
-      <w:r>
-        <w:t>④ 아카이브 로그 백업 및 삭제</w:t>
-      </w:r>
-    </w:p>
-    <w:p>
-      <w:r>
-        <w:t>모든 복구와 검증이 완료된 이후 아카이브 로그를 백업하고 입력 로그를 삭제하여 디스크 공간을 확보하였다. 복구 가능 시점이 필요한 상태에서 먼저 삭제하지 않도록 주의하였다.</w:t>
-      </w:r>
-    </w:p>
-    <w:p>
-      <w:pPr>
-        <w:spacing w:after="80"/>
-        <w:ind w:left="288"/>
-        <w:shd w:val="clear" w:fill="F2F3F5"/>
-      </w:pPr>
-      <w:r>
-        <w:rPr>
-          <w:rFonts w:ascii="Consolas" w:hAnsi="Consolas" w:eastAsia="Consolas"/>
-          <w:sz w:val="19"/>
-        </w:rPr>
-        <w:t>RMAN&gt; BACKUP ARCHIVELOG ALL DELETE INPUT;</w:t>
-      </w:r>
-    </w:p>
-    <w:p>
-      <w:pPr>
-        <w:jc w:val="center"/>
-      </w:pPr>
-      <w:r>
-        <w:drawing>
-          <wp:inline xmlns:a="http://schemas.openxmlformats.org/drawingml/2006/main" xmlns:pic="http://schemas.openxmlformats.org/drawingml/2006/picture">
-            <wp:extent cx="5731510" cy="4296745"/>
-            <wp:docPr id="48" name="Picture 48"/>
-            <wp:cNvGraphicFramePr>
-              <a:graphicFrameLocks noChangeAspect="1"/>
-            </wp:cNvGraphicFramePr>
-            <a:graphic>
-              <a:graphicData uri="http://schemas.openxmlformats.org/drawingml/2006/picture">
-                <pic:pic>
-                  <pic:nvPicPr>
-                    <pic:cNvPr id="0" name="image.png"/>
-                    <pic:cNvPicPr/>
-                  </pic:nvPicPr>
-                  <pic:blipFill>
-                    <a:blip r:embed="rId66"/>
-                    <a:stretch>
-                      <a:fillRect/>
-                    </a:stretch>
-                  </pic:blipFill>
-                  <pic:spPr>
-                    <a:xfrm>
-                      <a:off x="0" y="0"/>
-                      <a:ext cx="5731510" cy="4296745"/>
-                    </a:xfrm>
-                    <a:prstGeom prst="rect"/>
-                  </pic:spPr>
-                </pic:pic>
-              </a:graphicData>
-            </a:graphic>
-          </wp:inline>
-        </w:drawing>
-      </w:r>
-    </w:p>
-    <w:p>
-      <w:pPr>
-        <w:pStyle w:val="a5"/>
-        <w:jc w:val="center"/>
-      </w:pPr>
-      <w:r>
-        <w:t>Figure 3-27. 복구 실습 종료 후 아카이브 로그 백업 및 정리</w:t>
-      </w:r>
-    </w:p>
-    <w:p>
-      <w:pPr>
-        <w:pStyle w:val="2"/>
-      </w:pPr>
-      <w:r>
-        <w:t>8) 종합 결과 및 결론</w:t>
-      </w:r>
-    </w:p>
-    <w:tbl>
-      <w:tblPr>
-        <w:tblStyle w:val="a4"/>
-        <w:tblW w:type="auto" w:w="0"/>
-        <w:tblLook w:firstColumn="1" w:firstRow="1" w:lastColumn="0" w:lastRow="0" w:noHBand="0" w:noVBand="1" w:val="04A0"/>
-      </w:tblPr>
-      <w:tblGrid>
-        <w:gridCol w:w="1504"/>
-        <w:gridCol w:w="1504"/>
-        <w:gridCol w:w="1504"/>
-        <w:gridCol w:w="1504"/>
-        <w:gridCol w:w="1504"/>
-        <w:gridCol w:w="1504"/>
-      </w:tblGrid>
-      <w:tr>
-        <w:tc>
-          <w:tcPr>
-            <w:tcW w:type="dxa" w:w="1504"/>
-          </w:tcPr>
-          <w:p>
-            <w:r/>
-            <w:r>
-              <w:rPr>
-                <w:b/>
-                <w:sz w:val="19"/>
-              </w:rPr>
-              <w:t>Case</w:t>
-            </w:r>
-          </w:p>
-        </w:tc>
-        <w:tc>
-          <w:tcPr>
-            <w:tcW w:type="dxa" w:w="1504"/>
-          </w:tcPr>
-          <w:p>
-            <w:r/>
-            <w:r>
-              <w:rPr>
-                <w:b/>
-                <w:sz w:val="19"/>
-              </w:rPr>
-              <w:t>장애 범위</w:t>
-            </w:r>
-          </w:p>
-        </w:tc>
-        <w:tc>
-          <w:tcPr>
-            <w:tcW w:type="dxa" w:w="1504"/>
-          </w:tcPr>
-          <w:p>
-            <w:r/>
-            <w:r>
-              <w:rPr>
-                <w:b/>
-                <w:sz w:val="19"/>
-              </w:rPr>
-              <w:t>복구 기술</w:t>
-            </w:r>
-          </w:p>
-        </w:tc>
-        <w:tc>
-          <w:tcPr>
-            <w:tcW w:type="dxa" w:w="1504"/>
-          </w:tcPr>
-          <w:p>
-            <w:r/>
-            <w:r>
-              <w:rPr>
-                <w:b/>
-                <w:sz w:val="19"/>
-              </w:rPr>
-              <w:t>DB 상태</w:t>
-            </w:r>
-          </w:p>
-        </w:tc>
-        <w:tc>
-          <w:tcPr>
-            <w:tcW w:type="dxa" w:w="1504"/>
-          </w:tcPr>
-          <w:p>
-            <w:r/>
-            <w:r>
-              <w:rPr>
-                <w:b/>
-                <w:sz w:val="19"/>
-              </w:rPr>
-              <w:t>서비스 영향</w:t>
-            </w:r>
-          </w:p>
-        </w:tc>
-        <w:tc>
-          <w:tcPr>
-            <w:tcW w:type="dxa" w:w="1504"/>
-          </w:tcPr>
-          <w:p>
-            <w:r/>
-            <w:r>
-              <w:rPr>
-                <w:b/>
-                <w:sz w:val="19"/>
-              </w:rPr>
-              <w:t>핵심 결과</w:t>
-            </w:r>
-          </w:p>
-        </w:tc>
-      </w:tr>
-      <w:tr>
-        <w:tc>
-          <w:tcPr>
-            <w:tcW w:type="dxa" w:w="1504"/>
-          </w:tcPr>
-          <w:p>
-            <w:r/>
-            <w:r>
-              <w:rPr>
-                <w:sz w:val="19"/>
-              </w:rPr>
-              <w:t>1</w:t>
-            </w:r>
-          </w:p>
-        </w:tc>
-        <w:tc>
-          <w:tcPr>
-            <w:tcW w:type="dxa" w:w="1504"/>
-          </w:tcPr>
-          <w:p>
-            <w:r/>
-            <w:r>
-              <w:rPr>
-                <w:sz w:val="19"/>
-              </w:rPr>
-              <w:t>ORDERS 데이터파일</w:t>
-            </w:r>
-          </w:p>
-        </w:tc>
-        <w:tc>
-          <w:tcPr>
-            <w:tcW w:type="dxa" w:w="1504"/>
-          </w:tcPr>
-          <w:p>
-            <w:r/>
-            <w:r>
-              <w:rPr>
-                <w:sz w:val="19"/>
-              </w:rPr>
-              <w:t>RMAN Datafile Recovery</w:t>
-            </w:r>
-          </w:p>
-        </w:tc>
-        <w:tc>
-          <w:tcPr>
-            <w:tcW w:type="dxa" w:w="1504"/>
-          </w:tcPr>
-          <w:p>
-            <w:r/>
-            <w:r>
-              <w:rPr>
-                <w:sz w:val="19"/>
-              </w:rPr>
-              <w:t>OPEN</w:t>
-            </w:r>
-          </w:p>
-        </w:tc>
-        <w:tc>
-          <w:tcPr>
-            <w:tcW w:type="dxa" w:w="1504"/>
-          </w:tcPr>
-          <w:p>
-            <w:r/>
-            <w:r>
-              <w:rPr>
-                <w:sz w:val="19"/>
-              </w:rPr>
-              <w:t>ORDERS만 일시 사용 불가</w:t>
-            </w:r>
-          </w:p>
-        </w:tc>
-        <w:tc>
-          <w:tcPr>
-            <w:tcW w:type="dxa" w:w="1504"/>
-          </w:tcPr>
-          <w:p>
-            <w:r/>
-            <w:r>
-              <w:rPr>
-                <w:sz w:val="19"/>
-              </w:rPr>
-              <w:t>파일 단위 격리 확인</w:t>
-            </w:r>
-          </w:p>
-        </w:tc>
-      </w:tr>
-      <w:tr>
-        <w:tc>
-          <w:tcPr>
-            <w:tcW w:type="dxa" w:w="1504"/>
-          </w:tcPr>
-          <w:p>
-            <w:r/>
-            <w:r>
-              <w:rPr>
-                <w:sz w:val="19"/>
-              </w:rPr>
-              <w:t>2</w:t>
-            </w:r>
-          </w:p>
-        </w:tc>
-        <w:tc>
-          <w:tcPr>
-            <w:tcW w:type="dxa" w:w="1504"/>
-          </w:tcPr>
-          <w:p>
-            <w:r/>
-            <w:r>
-              <w:rPr>
-                <w:sz w:val="19"/>
-              </w:rPr>
-              <w:t>SYSTEM 데이터파일</w:t>
-            </w:r>
-          </w:p>
-        </w:tc>
-        <w:tc>
-          <w:tcPr>
-            <w:tcW w:type="dxa" w:w="1504"/>
-          </w:tcPr>
-          <w:p>
-            <w:r/>
-            <w:r>
-              <w:rPr>
-                <w:sz w:val="19"/>
-              </w:rPr>
-              <w:t>Closed Recovery</w:t>
-            </w:r>
-          </w:p>
-        </w:tc>
-        <w:tc>
-          <w:tcPr>
-            <w:tcW w:type="dxa" w:w="1504"/>
-          </w:tcPr>
-          <w:p>
-            <w:r/>
-            <w:r>
-              <w:rPr>
-                <w:sz w:val="19"/>
-              </w:rPr>
-              <w:t>MOUNT</w:t>
-            </w:r>
-          </w:p>
-        </w:tc>
-        <w:tc>
-          <w:tcPr>
-            <w:tcW w:type="dxa" w:w="1504"/>
-          </w:tcPr>
-          <w:p>
-            <w:r/>
-            <w:r>
-              <w:rPr>
-                <w:sz w:val="19"/>
-              </w:rPr>
-              <w:t>전체 중단</w:t>
-            </w:r>
-          </w:p>
-        </w:tc>
-        <w:tc>
-          <w:tcPr>
-            <w:tcW w:type="dxa" w:w="1504"/>
-          </w:tcPr>
-          <w:p>
-            <w:r/>
-            <w:r>
-              <w:rPr>
-                <w:sz w:val="19"/>
-              </w:rPr>
-              <w:t>필수 파일 복구 확인</w:t>
-            </w:r>
-          </w:p>
-        </w:tc>
-      </w:tr>
-      <w:tr>
-        <w:tc>
-          <w:tcPr>
-            <w:tcW w:type="dxa" w:w="1504"/>
-          </w:tcPr>
-          <w:p>
-            <w:r/>
-            <w:r>
-              <w:rPr>
-                <w:sz w:val="19"/>
-              </w:rPr>
-              <w:t>3</w:t>
-            </w:r>
-          </w:p>
-        </w:tc>
-        <w:tc>
-          <w:tcPr>
-            <w:tcW w:type="dxa" w:w="1504"/>
-          </w:tcPr>
-          <w:p>
-            <w:r/>
-            <w:r>
-              <w:rPr>
-                <w:sz w:val="19"/>
-              </w:rPr>
-              <w:t>INQUIRIES 특정 블록</w:t>
-            </w:r>
-          </w:p>
-        </w:tc>
-        <w:tc>
-          <w:tcPr>
-            <w:tcW w:type="dxa" w:w="1504"/>
-          </w:tcPr>
-          <w:p>
-            <w:r/>
-            <w:r>
-              <w:rPr>
-                <w:sz w:val="19"/>
-              </w:rPr>
-              <w:t>Block Media Recovery</w:t>
-            </w:r>
-          </w:p>
-        </w:tc>
-        <w:tc>
-          <w:tcPr>
-            <w:tcW w:type="dxa" w:w="1504"/>
-          </w:tcPr>
-          <w:p>
-            <w:r/>
-            <w:r>
-              <w:rPr>
-                <w:sz w:val="19"/>
-              </w:rPr>
-              <w:t>OPEN</w:t>
-            </w:r>
-          </w:p>
-        </w:tc>
-        <w:tc>
-          <w:tcPr>
-            <w:tcW w:type="dxa" w:w="1504"/>
-          </w:tcPr>
-          <w:p>
-            <w:r/>
-            <w:r>
-              <w:rPr>
-                <w:sz w:val="19"/>
-              </w:rPr>
-              <w:t>손상 블록 접근 실패</w:t>
-            </w:r>
-          </w:p>
-        </w:tc>
-        <w:tc>
-          <w:tcPr>
-            <w:tcW w:type="dxa" w:w="1504"/>
-          </w:tcPr>
-          <w:p>
-            <w:r/>
-            <w:r>
-              <w:rPr>
-                <w:sz w:val="19"/>
-              </w:rPr>
-              <w:t>최소 범위 복구 확인</w:t>
-            </w:r>
-          </w:p>
-        </w:tc>
-      </w:tr>
-      <w:tr>
-        <w:tc>
-          <w:tcPr>
-            <w:tcW w:type="dxa" w:w="1504"/>
-          </w:tcPr>
-          <w:p>
-            <w:r/>
-            <w:r>
-              <w:rPr>
-                <w:sz w:val="19"/>
-              </w:rPr>
-              <w:t>4A</w:t>
-            </w:r>
-          </w:p>
-        </w:tc>
-        <w:tc>
-          <w:tcPr>
-            <w:tcW w:type="dxa" w:w="1504"/>
-          </w:tcPr>
-          <w:p>
-            <w:r/>
-            <w:r>
-              <w:rPr>
-                <w:sz w:val="19"/>
-              </w:rPr>
-              <w:t>행 전체 DELETE</w:t>
-            </w:r>
-          </w:p>
-        </w:tc>
-        <w:tc>
-          <w:tcPr>
-            <w:tcW w:type="dxa" w:w="1504"/>
-          </w:tcPr>
-          <w:p>
-            <w:r/>
-            <w:r>
-              <w:rPr>
-                <w:sz w:val="19"/>
-              </w:rPr>
-              <w:t>Flashback Table</w:t>
-            </w:r>
-          </w:p>
-        </w:tc>
-        <w:tc>
-          <w:tcPr>
-            <w:tcW w:type="dxa" w:w="1504"/>
-          </w:tcPr>
-          <w:p>
-            <w:r/>
-            <w:r>
-              <w:rPr>
-                <w:sz w:val="19"/>
-              </w:rPr>
-              <w:t>OPEN</w:t>
-            </w:r>
-          </w:p>
-        </w:tc>
-        <w:tc>
-          <w:tcPr>
-            <w:tcW w:type="dxa" w:w="1504"/>
-          </w:tcPr>
-          <w:p>
-            <w:r/>
-            <w:r>
-              <w:rPr>
-                <w:sz w:val="19"/>
-              </w:rPr>
-              <w:t>대상 데이터 논리 손상</w:t>
-            </w:r>
-          </w:p>
-        </w:tc>
-        <w:tc>
-          <w:tcPr>
-            <w:tcW w:type="dxa" w:w="1504"/>
-          </w:tcPr>
-          <w:p>
-            <w:r/>
-            <w:r>
-              <w:rPr>
-                <w:sz w:val="19"/>
-              </w:rPr>
-              <w:t>SCN 기반 복구</w:t>
-            </w:r>
-          </w:p>
-        </w:tc>
-      </w:tr>
-      <w:tr>
-        <w:tc>
-          <w:tcPr>
-            <w:tcW w:type="dxa" w:w="1504"/>
-          </w:tcPr>
-          <w:p>
-            <w:r/>
-            <w:r>
-              <w:rPr>
-                <w:sz w:val="19"/>
-              </w:rPr>
-              <w:t>4B</w:t>
-            </w:r>
-          </w:p>
-        </w:tc>
-        <w:tc>
-          <w:tcPr>
-            <w:tcW w:type="dxa" w:w="1504"/>
-          </w:tcPr>
-          <w:p>
-            <w:r/>
-            <w:r>
-              <w:rPr>
-                <w:sz w:val="19"/>
-              </w:rPr>
-              <w:t>테이블 DROP</w:t>
-            </w:r>
-          </w:p>
-        </w:tc>
-        <w:tc>
-          <w:tcPr>
-            <w:tcW w:type="dxa" w:w="1504"/>
-          </w:tcPr>
-          <w:p>
-            <w:r/>
-            <w:r>
-              <w:rPr>
-                <w:sz w:val="19"/>
-              </w:rPr>
-              <w:t>Flashback Drop</w:t>
-            </w:r>
-          </w:p>
-        </w:tc>
-        <w:tc>
-          <w:tcPr>
-            <w:tcW w:type="dxa" w:w="1504"/>
-          </w:tcPr>
-          <w:p>
-            <w:r/>
-            <w:r>
-              <w:rPr>
-                <w:sz w:val="19"/>
-              </w:rPr>
-              <w:t>OPEN</w:t>
-            </w:r>
-          </w:p>
-        </w:tc>
-        <w:tc>
-          <w:tcPr>
-            <w:tcW w:type="dxa" w:w="1504"/>
-          </w:tcPr>
-          <w:p>
-            <w:r/>
-            <w:r>
-              <w:rPr>
-                <w:sz w:val="19"/>
-              </w:rPr>
-              <w:t>대상 객체 부재</w:t>
-            </w:r>
-          </w:p>
-        </w:tc>
-        <w:tc>
-          <w:tcPr>
-            <w:tcW w:type="dxa" w:w="1504"/>
-          </w:tcPr>
-          <w:p>
-            <w:r/>
-            <w:r>
-              <w:rPr>
-                <w:sz w:val="19"/>
-              </w:rPr>
-              <w:t>Recycle Bin 복구</w:t>
-            </w:r>
-          </w:p>
-        </w:tc>
-      </w:tr>
-      <w:tr>
-        <w:tc>
-          <w:tcPr>
-            <w:tcW w:type="dxa" w:w="1504"/>
-          </w:tcPr>
-          <w:p>
-            <w:r/>
-            <w:r>
-              <w:rPr>
-                <w:sz w:val="19"/>
-              </w:rPr>
-              <w:t>5</w:t>
-            </w:r>
-          </w:p>
-        </w:tc>
-        <w:tc>
-          <w:tcPr>
-            <w:tcW w:type="dxa" w:w="1504"/>
-          </w:tcPr>
-          <w:p>
-            <w:r/>
-            <w:r>
-              <w:rPr>
-                <w:sz w:val="19"/>
-              </w:rPr>
-              <w:t>객체 유실·Recycle Bin 부재</w:t>
-            </w:r>
-          </w:p>
-        </w:tc>
-        <w:tc>
-          <w:tcPr>
-            <w:tcW w:type="dxa" w:w="1504"/>
-          </w:tcPr>
-          <w:p>
-            <w:r/>
-            <w:r>
-              <w:rPr>
-                <w:sz w:val="19"/>
-              </w:rPr>
-              <w:t>Original Import</w:t>
-            </w:r>
-          </w:p>
-        </w:tc>
-        <w:tc>
-          <w:tcPr>
-            <w:tcW w:type="dxa" w:w="1504"/>
-          </w:tcPr>
-          <w:p>
-            <w:r/>
-            <w:r>
-              <w:rPr>
-                <w:sz w:val="19"/>
-              </w:rPr>
-              <w:t>OPEN</w:t>
-            </w:r>
-          </w:p>
-        </w:tc>
-        <w:tc>
-          <w:tcPr>
-            <w:tcW w:type="dxa" w:w="1504"/>
-          </w:tcPr>
-          <w:p>
-            <w:r/>
-            <w:r>
-              <w:rPr>
-                <w:sz w:val="19"/>
-              </w:rPr>
-              <w:t>대상 객체 부재</w:t>
-            </w:r>
-          </w:p>
-        </w:tc>
-        <w:tc>
-          <w:tcPr>
-            <w:tcW w:type="dxa" w:w="1504"/>
-          </w:tcPr>
-          <w:p>
-            <w:r/>
-            <w:r>
-              <w:rPr>
-                <w:sz w:val="19"/>
-              </w:rPr>
-              <w:t>덤프 기반 복원</w:t>
-            </w:r>
-          </w:p>
-        </w:tc>
-      </w:tr>
-    </w:tbl>
-    <w:p>
-      <w:pPr>
-        <w:pStyle w:val="a5"/>
-        <w:jc w:val="center"/>
-      </w:pPr>
-      <w:r>
-        <w:t>Table 3-8. 장애 시나리오별 복구 방식과 최종 검증 결과</w:t>
-      </w:r>
-    </w:p>
-    <w:p>
-      <w:r>
-        <w:t>본 Part에서는 데이터파일·SYSTEM 파일·데이터 블록의 물리적 손상과 DELETE·DROP·객체 유실의 논리적 장애를 재현하고, 손상 범위에 맞는 복구 절차를 검증하였다.</w:t>
-      </w:r>
-    </w:p>
-    <w:p>
-      <w:r>
-        <w:t>Case 1과 Case 3은 데이터베이스를 OPEN 상태로 유지한 채 각각 데이터파일과 블록을 복구할 수 있었으며, 정상 테이블스페이스의 서비스는 지속되었다. 다만 복구 대상 객체 또는 손상 블록은 복구 완료 전까지 사용할 수 없었다. Case 2는 SYSTEM 데이터파일이 데이터베이스 운영에 필수적인 파일이므로 MOUNT 상태에서 Closed Recovery를 수행해야 했다.</w:t>
-      </w:r>
-    </w:p>
-    <w:p>
-      <w:r>
-        <w:t>논리적 장애에서는 Flashback Table과 Flashback Drop을 통해 백업 복원 없이 대상 데이터와 객체를 복구하였다. 그러나 Flashback Table은 UNDO 보존 범위, Flashback Drop은 Recycle Bin 보존 여부라는 제약이 있었다. Recycle Bin에 객체가 남아 있지 않은 경우에는 사전 Export 덤프와 올바른 Import 도구가 복구 수단이 되었다.</w:t>
-      </w:r>
-    </w:p>
-    <w:p>
-      <w:r>
-        <w:t>실습에서 확인한 첫 번째 핵심은 격리 설계의 범위이다. 파일 단위 장애의 영향을 분리하려면 테이블스페이스만 나누는 것으로 충분하지 않으며, 테이블과 관련된 인덱스·LOB 세그먼트까지 동일한 복구 경계에 포함해야 한다.</w:t>
-      </w:r>
-    </w:p>
-    <w:p>
-      <w:r>
-        <w:t>두 번째 핵심은 장애 검출 방식이다. 열린 파일 핸들과 인덱스 전용 실행계획 때문에 데이터파일이 손상되어도 일부 SQL이 정상 실행될 수 있었다. 따라서 장애 여부는 단순 조회 결과뿐 아니라 실제 테이블 블록 접근, 실행계획, 데이터파일·테이블스페이스 상태 및 손상 뷰를 함께 확인해야 한다.</w:t>
-      </w:r>
-    </w:p>
-    <w:p>
-      <w:r>
-        <w:t>세 번째 핵심은 복구 범위의 경계이다. RMAN, Flashback Table, Flashback Drop 및 Import는 각각 복구할 수 있는 범위가 다르다. 복구 완료 후에는 데이터 건수뿐 아니라 인덱스, PK·FK, 권한 및 종속 객체까지 별도로 검증해야 완전한 복구로 판단할 수 있다.</w:t>
-      </w:r>
-    </w:p>
-    <w:p>
-      <w:r>
-        <w:t>결론적으로 백업·복구 전략은 장애 발생 후 명령을 실행하는 절차에 그치지 않는다. 사고 이전의 물리적 격리 설계, 백업 확보, 장애 범위 식별, 최소 단위 복구, 종속 객체 검증까지 포함한 전체 운영 체계로 설계해야 한다.</w:t>
-      </w:r>
-    </w:p>
-    <w:p>
-      <w:pPr>
-        <w:pStyle w:val="2"/>
-      </w:pPr>
-      <w:r>
-        <w:t>Appendix. 초기 실행 화면 보존</w:t>
-      </w:r>
-    </w:p>
-    <w:p>
-      <w:r>
-        <w:t>A-3. Case 4A 초기 TIMESTAMP 방식 Flashback Table 실행 화면 (219,995건 복구):</w:t>
       </w:r>
     </w:p>
     <w:p>
@@ -6203,8 +7167,16 @@
       </w:r>
     </w:p>
     <w:p>
-      <w:r>
-        <w:t>A-4. Case 4B 초기 CATEGORIES CASCADE CONSTRAINTS DROP·Flashback Drop·PRODUCTS_R1 수동 재생성 실행 화면:</w:t>
+      <w:pPr>
+        <w:pStyle w:val="3"/>
+      </w:pPr>
+      <w:r>
+        <w:t>A-4. 업무 테이블 Flashback Drop 초기 실험과 외부 FK 복구</w:t>
+      </w:r>
+    </w:p>
+    <w:p>
+      <w:r>
+        <w:t>Case 4B를 최초에는 실제 업무 테이블 CATEGORIES를 CASCADE CONSTRAINTS로 DROP한 뒤 Flashback Drop으로 복구하였다. 이때 함께 제거된 외부 FK(PRODUCTS_R1)가 자동 복구되지 않아, DBA_CONSTRAINTS AS OF TIMESTAMP로 DROP 이전 정의를 확인하여 수동 재생성해야 했다. Flashback Drop이 다른 테이블에서 제거된 FK까지 자동 복구하지 않는다는 복구 범위의 한계를 보여주는 자료이므로 보존한다.</w:t>
       </w:r>
     </w:p>
     <w:p>
@@ -6676,8 +7648,16 @@
       </w:r>
     </w:p>
     <w:p>
-      <w:r>
-        <w:t>A-5. 초기 보호용 RMAN Full Backup(구조 변경 전) 실행 화면:</w:t>
+      <w:pPr>
+        <w:pStyle w:val="3"/>
+      </w:pPr>
+      <w:r>
+        <w:t>A-5. 전용 테이블스페이스 구성 전 초기 보호 백업</w:t>
+      </w:r>
+    </w:p>
+    <w:p>
+      <w:r>
+        <w:t>전용 테이블스페이스 생성·객체 이동 이전에 수행한 초기 보호용 RMAN Full Backup 화면이다. 본문 Figure 3-5의 베이스라인 백업은 구조 변경 이후 다시 수행한 것이다.</w:t>
       </w:r>
     </w:p>
     <w:p>

</xml_diff>